<commit_message>
doc added and edited
</commit_message>
<xml_diff>
--- a/docs/DCITP1A04_RJ_KangZiXuan.docx
+++ b/docs/DCITP1A04_RJ_KangZiXuan.docx
@@ -465,936 +465,6 @@
         <w:t>the wordcount.</w:t>
       </w:r>
     </w:p>
-    <w:tbl>
-      <w:tblPr>
-        <w:tblW w:w="5000" w:type="pct"/>
-        <w:tblBorders>
-          <w:top w:val="single" w:sz="4" w:space="0" w:color="auto"/>
-          <w:left w:val="single" w:sz="4" w:space="0" w:color="auto"/>
-          <w:bottom w:val="single" w:sz="4" w:space="0" w:color="auto"/>
-          <w:right w:val="single" w:sz="4" w:space="0" w:color="auto"/>
-          <w:insideH w:val="single" w:sz="4" w:space="0" w:color="auto"/>
-          <w:insideV w:val="single" w:sz="4" w:space="0" w:color="auto"/>
-        </w:tblBorders>
-        <w:tblCellMar>
-          <w:left w:w="10" w:type="dxa"/>
-          <w:right w:w="10" w:type="dxa"/>
-        </w:tblCellMar>
-        <w:tblLook w:val="0000" w:firstRow="0" w:lastRow="0" w:firstColumn="0" w:lastColumn="0" w:noHBand="0" w:noVBand="0"/>
-      </w:tblPr>
-      <w:tblGrid>
-        <w:gridCol w:w="2254"/>
-        <w:gridCol w:w="1352"/>
-        <w:gridCol w:w="5410"/>
-      </w:tblGrid>
-      <w:tr>
-        <w:tc>
-          <w:tcPr>
-            <w:tcW w:w="1250" w:type="pct"/>
-            <w:shd w:val="clear" w:color="auto" w:fill="E8E8E8" w:themeFill="background2"/>
-            <w:tcMar>
-              <w:top w:w="80" w:type="dxa"/>
-              <w:left w:w="100" w:type="dxa"/>
-              <w:bottom w:w="80" w:type="dxa"/>
-              <w:right w:w="100" w:type="dxa"/>
-            </w:tcMar>
-            <w:vAlign w:val="center"/>
-          </w:tcPr>
-          <w:p>
-            <w:pPr>
-              <w:spacing w:after="120"/>
-            </w:pPr>
-            <w:r>
-              <w:rPr>
-                <w:rStyle w:val="Strong"/>
-              </w:rPr>
-              <w:t>Page</w:t>
-            </w:r>
-          </w:p>
-        </w:tc>
-        <w:tc>
-          <w:tcPr>
-            <w:tcW w:w="750" w:type="pct"/>
-            <w:shd w:val="clear" w:color="auto" w:fill="E8E8E8" w:themeFill="background2"/>
-            <w:tcMar>
-              <w:top w:w="80" w:type="dxa"/>
-              <w:left w:w="100" w:type="dxa"/>
-              <w:bottom w:w="80" w:type="dxa"/>
-              <w:right w:w="100" w:type="dxa"/>
-            </w:tcMar>
-            <w:vAlign w:val="center"/>
-          </w:tcPr>
-          <w:p>
-            <w:pPr>
-              <w:spacing w:after="120"/>
-            </w:pPr>
-            <w:r>
-              <w:rPr>
-                <w:rStyle w:val="Strong"/>
-              </w:rPr>
-              <w:t>Owner</w:t>
-            </w:r>
-          </w:p>
-        </w:tc>
-        <w:tc>
-          <w:tcPr>
-            <w:tcW w:w="3000" w:type="pct"/>
-            <w:shd w:val="clear" w:color="auto" w:fill="E8E8E8" w:themeFill="background2"/>
-            <w:tcMar>
-              <w:top w:w="80" w:type="dxa"/>
-              <w:left w:w="100" w:type="dxa"/>
-              <w:bottom w:w="80" w:type="dxa"/>
-              <w:right w:w="100" w:type="dxa"/>
-            </w:tcMar>
-            <w:vAlign w:val="center"/>
-          </w:tcPr>
-          <w:p>
-            <w:pPr>
-              <w:spacing w:after="120"/>
-            </w:pPr>
-            <w:r>
-              <w:rPr>
-                <w:rStyle w:val="Strong"/>
-              </w:rPr>
-              <w:t>Key content / purpose</w:t>
-            </w:r>
-          </w:p>
-        </w:tc>
-      </w:tr>
-      <w:tr>
-        <w:tc>
-          <w:tcPr>
-            <w:tcW w:w="0" w:type="auto"/>
-            <w:tcMar>
-              <w:top w:w="80" w:type="dxa"/>
-              <w:left w:w="100" w:type="dxa"/>
-              <w:bottom w:w="80" w:type="dxa"/>
-              <w:right w:w="100" w:type="dxa"/>
-            </w:tcMar>
-            <w:vAlign w:val="center"/>
-          </w:tcPr>
-          <w:p>
-            <w:pPr>
-              <w:spacing w:after="120"/>
-            </w:pPr>
-            <w:r>
-              <w:rPr>
-                <w:rStyle w:val="Strong"/>
-              </w:rPr>
-              <w:t xml:space="preserve">Home </w:t>
-            </w:r>
-          </w:p>
-        </w:tc>
-        <w:tc>
-          <w:tcPr>
-            <w:tcW w:w="0" w:type="auto"/>
-            <w:tcMar>
-              <w:top w:w="80" w:type="dxa"/>
-              <w:left w:w="100" w:type="dxa"/>
-              <w:bottom w:w="80" w:type="dxa"/>
-              <w:right w:w="100" w:type="dxa"/>
-            </w:tcMar>
-            <w:vAlign w:val="center"/>
-          </w:tcPr>
-          <w:p>
-            <w:pPr>
-              <w:spacing w:after="120"/>
-            </w:pPr>
-            <w:r>
-              <w:rPr>
-                <w:rStyle w:val="Strong"/>
-              </w:rPr>
-              <w:t>Elisa</w:t>
-            </w:r>
-          </w:p>
-        </w:tc>
-        <w:tc>
-          <w:tcPr>
-            <w:tcW w:w="0" w:type="auto"/>
-            <w:tcMar>
-              <w:top w:w="80" w:type="dxa"/>
-              <w:left w:w="100" w:type="dxa"/>
-              <w:bottom w:w="80" w:type="dxa"/>
-              <w:right w:w="100" w:type="dxa"/>
-            </w:tcMar>
-            <w:vAlign w:val="center"/>
-          </w:tcPr>
-          <w:p>
-            <w:pPr>
-              <w:spacing w:after="120"/>
-            </w:pPr>
-            <w:r>
-              <w:t>Mission statement, snapshot of 3 featured tutors, "How it Works" teaser, sign-up CTA.</w:t>
-            </w:r>
-          </w:p>
-        </w:tc>
-      </w:tr>
-      <w:tr>
-        <w:tc>
-          <w:tcPr>
-            <w:tcW w:w="0" w:type="auto"/>
-            <w:tcMar>
-              <w:top w:w="80" w:type="dxa"/>
-              <w:left w:w="100" w:type="dxa"/>
-              <w:bottom w:w="80" w:type="dxa"/>
-              <w:right w:w="100" w:type="dxa"/>
-            </w:tcMar>
-            <w:vAlign w:val="center"/>
-          </w:tcPr>
-          <w:p>
-            <w:pPr>
-              <w:spacing w:after="120"/>
-            </w:pPr>
-            <w:r>
-              <w:rPr>
-                <w:rStyle w:val="Strong"/>
-              </w:rPr>
-              <w:t>Sessions</w:t>
-            </w:r>
-          </w:p>
-        </w:tc>
-        <w:tc>
-          <w:tcPr>
-            <w:tcW w:w="0" w:type="auto"/>
-            <w:tcMar>
-              <w:top w:w="80" w:type="dxa"/>
-              <w:left w:w="100" w:type="dxa"/>
-              <w:bottom w:w="80" w:type="dxa"/>
-              <w:right w:w="100" w:type="dxa"/>
-            </w:tcMar>
-            <w:vAlign w:val="center"/>
-          </w:tcPr>
-          <w:p>
-            <w:pPr>
-              <w:spacing w:after="120" w:line="259" w:lineRule="auto"/>
-            </w:pPr>
-            <w:r>
-              <w:rPr>
-                <w:rStyle w:val="Strong"/>
-              </w:rPr>
-              <w:t>Elisa</w:t>
-            </w:r>
-          </w:p>
-        </w:tc>
-        <w:tc>
-          <w:tcPr>
-            <w:tcW w:w="0" w:type="auto"/>
-            <w:tcMar>
-              <w:top w:w="80" w:type="dxa"/>
-              <w:left w:w="100" w:type="dxa"/>
-              <w:bottom w:w="80" w:type="dxa"/>
-              <w:right w:w="100" w:type="dxa"/>
-            </w:tcMar>
-            <w:vAlign w:val="center"/>
-          </w:tcPr>
-          <w:p>
-            <w:pPr>
-              <w:spacing w:after="120"/>
-            </w:pPr>
-            <w:r>
-              <w:t>Displays the user's booked or upcoming tutoring sessions, including schedule and meeting details.</w:t>
-            </w:r>
-          </w:p>
-        </w:tc>
-      </w:tr>
-      <w:tr>
-        <w:tc>
-          <w:tcPr>
-            <w:tcW w:w="0" w:type="auto"/>
-            <w:tcMar>
-              <w:top w:w="80" w:type="dxa"/>
-              <w:left w:w="100" w:type="dxa"/>
-              <w:bottom w:w="80" w:type="dxa"/>
-              <w:right w:w="100" w:type="dxa"/>
-            </w:tcMar>
-            <w:vAlign w:val="center"/>
-          </w:tcPr>
-          <w:p>
-            <w:pPr>
-              <w:spacing w:after="120"/>
-            </w:pPr>
-            <w:r>
-              <w:rPr>
-                <w:rStyle w:val="Strong"/>
-              </w:rPr>
-              <w:t>Profile</w:t>
-            </w:r>
-          </w:p>
-        </w:tc>
-        <w:tc>
-          <w:tcPr>
-            <w:tcW w:w="0" w:type="auto"/>
-            <w:tcMar>
-              <w:top w:w="80" w:type="dxa"/>
-              <w:left w:w="100" w:type="dxa"/>
-              <w:bottom w:w="80" w:type="dxa"/>
-              <w:right w:w="100" w:type="dxa"/>
-            </w:tcMar>
-            <w:vAlign w:val="center"/>
-          </w:tcPr>
-          <w:p>
-            <w:pPr>
-              <w:spacing w:after="120" w:line="259" w:lineRule="auto"/>
-            </w:pPr>
-            <w:r>
-              <w:rPr>
-                <w:rStyle w:val="Strong"/>
-              </w:rPr>
-              <w:t>Elisa</w:t>
-            </w:r>
-          </w:p>
-        </w:tc>
-        <w:tc>
-          <w:tcPr>
-            <w:tcW w:w="0" w:type="auto"/>
-            <w:tcMar>
-              <w:top w:w="80" w:type="dxa"/>
-              <w:left w:w="100" w:type="dxa"/>
-              <w:bottom w:w="80" w:type="dxa"/>
-              <w:right w:w="100" w:type="dxa"/>
-            </w:tcMar>
-            <w:vAlign w:val="center"/>
-          </w:tcPr>
-          <w:p>
-            <w:pPr>
-              <w:spacing w:after="120"/>
-            </w:pPr>
-            <w:r>
-              <w:t>User profile page where students/parents can view and update their personal information and account details.</w:t>
-            </w:r>
-          </w:p>
-        </w:tc>
-      </w:tr>
-      <w:tr>
-        <w:tc>
-          <w:tcPr>
-            <w:tcW w:w="0" w:type="auto"/>
-            <w:tcMar>
-              <w:top w:w="80" w:type="dxa"/>
-              <w:left w:w="100" w:type="dxa"/>
-              <w:bottom w:w="80" w:type="dxa"/>
-              <w:right w:w="100" w:type="dxa"/>
-            </w:tcMar>
-            <w:vAlign w:val="center"/>
-          </w:tcPr>
-          <w:p>
-            <w:pPr>
-              <w:spacing w:after="120"/>
-            </w:pPr>
-            <w:r>
-              <w:rPr>
-                <w:rStyle w:val="Strong"/>
-              </w:rPr>
-              <w:t>Tutor Profile</w:t>
-            </w:r>
-          </w:p>
-        </w:tc>
-        <w:tc>
-          <w:tcPr>
-            <w:tcW w:w="0" w:type="auto"/>
-            <w:tcMar>
-              <w:top w:w="80" w:type="dxa"/>
-              <w:left w:w="100" w:type="dxa"/>
-              <w:bottom w:w="80" w:type="dxa"/>
-              <w:right w:w="100" w:type="dxa"/>
-            </w:tcMar>
-            <w:vAlign w:val="center"/>
-          </w:tcPr>
-          <w:p>
-            <w:pPr>
-              <w:spacing w:after="120"/>
-            </w:pPr>
-            <w:r>
-              <w:rPr>
-                <w:rStyle w:val="Strong"/>
-              </w:rPr>
-              <w:t>Zi Xuan</w:t>
-            </w:r>
-          </w:p>
-        </w:tc>
-        <w:tc>
-          <w:tcPr>
-            <w:tcW w:w="0" w:type="auto"/>
-            <w:tcMar>
-              <w:top w:w="80" w:type="dxa"/>
-              <w:left w:w="100" w:type="dxa"/>
-              <w:bottom w:w="80" w:type="dxa"/>
-              <w:right w:w="100" w:type="dxa"/>
-            </w:tcMar>
-            <w:vAlign w:val="center"/>
-          </w:tcPr>
-          <w:p>
-            <w:pPr>
-              <w:spacing w:after="120"/>
-            </w:pPr>
-            <w:r>
-              <w:t>Full tutor bio, qualifications, availability, and "Request This Tutor" button.</w:t>
-            </w:r>
-          </w:p>
-        </w:tc>
-      </w:tr>
-      <w:tr>
-        <w:tc>
-          <w:tcPr>
-            <w:tcW w:w="0" w:type="auto"/>
-            <w:tcMar>
-              <w:top w:w="80" w:type="dxa"/>
-              <w:left w:w="100" w:type="dxa"/>
-              <w:bottom w:w="80" w:type="dxa"/>
-              <w:right w:w="100" w:type="dxa"/>
-            </w:tcMar>
-            <w:vAlign w:val="center"/>
-          </w:tcPr>
-          <w:p>
-            <w:pPr>
-              <w:spacing w:after="120"/>
-            </w:pPr>
-            <w:r>
-              <w:rPr>
-                <w:rStyle w:val="Strong"/>
-              </w:rPr>
-              <w:t>About Us</w:t>
-            </w:r>
-          </w:p>
-        </w:tc>
-        <w:tc>
-          <w:tcPr>
-            <w:tcW w:w="0" w:type="auto"/>
-            <w:tcMar>
-              <w:top w:w="80" w:type="dxa"/>
-              <w:left w:w="100" w:type="dxa"/>
-              <w:bottom w:w="80" w:type="dxa"/>
-              <w:right w:w="100" w:type="dxa"/>
-            </w:tcMar>
-            <w:vAlign w:val="center"/>
-          </w:tcPr>
-          <w:p>
-            <w:pPr>
-              <w:spacing w:after="120"/>
-            </w:pPr>
-            <w:r>
-              <w:rPr>
-                <w:rStyle w:val="Strong"/>
-              </w:rPr>
-              <w:t>Zi Xuan</w:t>
-            </w:r>
-          </w:p>
-        </w:tc>
-        <w:tc>
-          <w:tcPr>
-            <w:tcW w:w="0" w:type="auto"/>
-            <w:tcMar>
-              <w:top w:w="80" w:type="dxa"/>
-              <w:left w:w="100" w:type="dxa"/>
-              <w:bottom w:w="80" w:type="dxa"/>
-              <w:right w:w="100" w:type="dxa"/>
-            </w:tcMar>
-            <w:vAlign w:val="center"/>
-          </w:tcPr>
-          <w:p>
-            <w:pPr>
-              <w:spacing w:after="120"/>
-            </w:pPr>
-            <w:r>
-              <w:t xml:space="preserve">The problem (tuition cost vs. exchange-rate advantage), team bios, and why we built </w:t>
-            </w:r>
-            <w:proofErr w:type="spellStart"/>
-            <w:r>
-              <w:t>TutorBridge</w:t>
-            </w:r>
-            <w:proofErr w:type="spellEnd"/>
-            <w:r>
-              <w:t>.</w:t>
-            </w:r>
-          </w:p>
-        </w:tc>
-      </w:tr>
-      <w:tr>
-        <w:tc>
-          <w:tcPr>
-            <w:tcW w:w="0" w:type="auto"/>
-            <w:tcMar>
-              <w:top w:w="80" w:type="dxa"/>
-              <w:left w:w="100" w:type="dxa"/>
-              <w:bottom w:w="80" w:type="dxa"/>
-              <w:right w:w="100" w:type="dxa"/>
-            </w:tcMar>
-            <w:vAlign w:val="center"/>
-          </w:tcPr>
-          <w:p>
-            <w:pPr>
-              <w:spacing w:after="120"/>
-            </w:pPr>
-            <w:r>
-              <w:rPr>
-                <w:rStyle w:val="Strong"/>
-              </w:rPr>
-              <w:t>Resources for Parents</w:t>
-            </w:r>
-          </w:p>
-        </w:tc>
-        <w:tc>
-          <w:tcPr>
-            <w:tcW w:w="0" w:type="auto"/>
-            <w:tcMar>
-              <w:top w:w="80" w:type="dxa"/>
-              <w:left w:w="100" w:type="dxa"/>
-              <w:bottom w:w="80" w:type="dxa"/>
-              <w:right w:w="100" w:type="dxa"/>
-            </w:tcMar>
-            <w:vAlign w:val="center"/>
-          </w:tcPr>
-          <w:p>
-            <w:pPr>
-              <w:spacing w:after="120"/>
-            </w:pPr>
-            <w:r>
-              <w:rPr>
-                <w:rStyle w:val="Strong"/>
-              </w:rPr>
-              <w:t>Zi Xuan</w:t>
-            </w:r>
-          </w:p>
-        </w:tc>
-        <w:tc>
-          <w:tcPr>
-            <w:tcW w:w="0" w:type="auto"/>
-            <w:tcMar>
-              <w:top w:w="80" w:type="dxa"/>
-              <w:left w:w="100" w:type="dxa"/>
-              <w:bottom w:w="80" w:type="dxa"/>
-              <w:right w:w="100" w:type="dxa"/>
-            </w:tcMar>
-            <w:vAlign w:val="center"/>
-          </w:tcPr>
-          <w:p>
-            <w:pPr>
-              <w:spacing w:after="120"/>
-            </w:pPr>
-            <w:r>
-              <w:t>Study tips, first-session preparation, and links to free educational resources.</w:t>
-            </w:r>
-          </w:p>
-        </w:tc>
-      </w:tr>
-      <w:tr>
-        <w:tc>
-          <w:tcPr>
-            <w:tcW w:w="0" w:type="auto"/>
-            <w:tcMar>
-              <w:top w:w="80" w:type="dxa"/>
-              <w:left w:w="100" w:type="dxa"/>
-              <w:bottom w:w="80" w:type="dxa"/>
-              <w:right w:w="100" w:type="dxa"/>
-            </w:tcMar>
-            <w:vAlign w:val="center"/>
-          </w:tcPr>
-          <w:p>
-            <w:pPr>
-              <w:spacing w:after="120"/>
-            </w:pPr>
-            <w:r>
-              <w:rPr>
-                <w:rStyle w:val="Strong"/>
-              </w:rPr>
-              <w:lastRenderedPageBreak/>
-              <w:t>Pricing / Currency Comparison</w:t>
-            </w:r>
-          </w:p>
-        </w:tc>
-        <w:tc>
-          <w:tcPr>
-            <w:tcW w:w="0" w:type="auto"/>
-            <w:tcMar>
-              <w:top w:w="80" w:type="dxa"/>
-              <w:left w:w="100" w:type="dxa"/>
-              <w:bottom w:w="80" w:type="dxa"/>
-              <w:right w:w="100" w:type="dxa"/>
-            </w:tcMar>
-            <w:vAlign w:val="center"/>
-          </w:tcPr>
-          <w:p>
-            <w:pPr>
-              <w:spacing w:after="120"/>
-            </w:pPr>
-            <w:r>
-              <w:rPr>
-                <w:rStyle w:val="Strong"/>
-              </w:rPr>
-              <w:t>Shin</w:t>
-            </w:r>
-          </w:p>
-        </w:tc>
-        <w:tc>
-          <w:tcPr>
-            <w:tcW w:w="0" w:type="auto"/>
-            <w:tcMar>
-              <w:top w:w="80" w:type="dxa"/>
-              <w:left w:w="100" w:type="dxa"/>
-              <w:bottom w:w="80" w:type="dxa"/>
-              <w:right w:w="100" w:type="dxa"/>
-            </w:tcMar>
-            <w:vAlign w:val="center"/>
-          </w:tcPr>
-          <w:p>
-            <w:pPr>
-              <w:spacing w:after="120"/>
-            </w:pPr>
-            <w:r>
-              <w:t>Calculator: input subject and hours → live cost comparison with local tuition rates.</w:t>
-            </w:r>
-          </w:p>
-        </w:tc>
-      </w:tr>
-      <w:tr>
-        <w:tc>
-          <w:tcPr>
-            <w:tcW w:w="0" w:type="auto"/>
-            <w:tcMar>
-              <w:top w:w="80" w:type="dxa"/>
-              <w:left w:w="100" w:type="dxa"/>
-              <w:bottom w:w="80" w:type="dxa"/>
-              <w:right w:w="100" w:type="dxa"/>
-            </w:tcMar>
-            <w:vAlign w:val="center"/>
-          </w:tcPr>
-          <w:p>
-            <w:pPr>
-              <w:spacing w:after="120"/>
-            </w:pPr>
-            <w:r>
-              <w:rPr>
-                <w:rStyle w:val="Strong"/>
-              </w:rPr>
-              <w:t>Sign-Up / Request a Tutor</w:t>
-            </w:r>
-          </w:p>
-        </w:tc>
-        <w:tc>
-          <w:tcPr>
-            <w:tcW w:w="0" w:type="auto"/>
-            <w:tcMar>
-              <w:top w:w="80" w:type="dxa"/>
-              <w:left w:w="100" w:type="dxa"/>
-              <w:bottom w:w="80" w:type="dxa"/>
-              <w:right w:w="100" w:type="dxa"/>
-            </w:tcMar>
-            <w:vAlign w:val="center"/>
-          </w:tcPr>
-          <w:p>
-            <w:pPr>
-              <w:spacing w:after="120"/>
-              <w:rPr>
-                <w:rFonts w:ascii="Calibri" w:eastAsia="Calibri" w:hAnsi="Calibri" w:cs="Calibri"/>
-                <w:sz w:val="22"/>
-                <w:szCs w:val="22"/>
-              </w:rPr>
-            </w:pPr>
-            <w:r>
-              <w:rPr>
-                <w:rStyle w:val="Strong"/>
-              </w:rPr>
-              <w:t>Shin</w:t>
-            </w:r>
-          </w:p>
-        </w:tc>
-        <w:tc>
-          <w:tcPr>
-            <w:tcW w:w="0" w:type="auto"/>
-            <w:tcMar>
-              <w:top w:w="80" w:type="dxa"/>
-              <w:left w:w="100" w:type="dxa"/>
-              <w:bottom w:w="80" w:type="dxa"/>
-              <w:right w:w="100" w:type="dxa"/>
-            </w:tcMar>
-            <w:vAlign w:val="center"/>
-          </w:tcPr>
-          <w:p>
-            <w:pPr>
-              <w:spacing w:after="120"/>
-            </w:pPr>
-            <w:r>
-              <w:t>Form for student/parent details, grade level, subject, budget, preferred time slots, with form validation.</w:t>
-            </w:r>
-          </w:p>
-        </w:tc>
-      </w:tr>
-      <w:tr>
-        <w:tc>
-          <w:tcPr>
-            <w:tcW w:w="0" w:type="auto"/>
-            <w:tcMar>
-              <w:top w:w="80" w:type="dxa"/>
-              <w:left w:w="100" w:type="dxa"/>
-              <w:bottom w:w="80" w:type="dxa"/>
-              <w:right w:w="100" w:type="dxa"/>
-            </w:tcMar>
-            <w:vAlign w:val="center"/>
-          </w:tcPr>
-          <w:p>
-            <w:pPr>
-              <w:spacing w:after="120"/>
-            </w:pPr>
-            <w:r>
-              <w:rPr>
-                <w:rStyle w:val="Strong"/>
-              </w:rPr>
-              <w:t>How It Works</w:t>
-            </w:r>
-          </w:p>
-        </w:tc>
-        <w:tc>
-          <w:tcPr>
-            <w:tcW w:w="0" w:type="auto"/>
-            <w:tcMar>
-              <w:top w:w="80" w:type="dxa"/>
-              <w:left w:w="100" w:type="dxa"/>
-              <w:bottom w:w="80" w:type="dxa"/>
-              <w:right w:w="100" w:type="dxa"/>
-            </w:tcMar>
-            <w:vAlign w:val="center"/>
-          </w:tcPr>
-          <w:p>
-            <w:pPr>
-              <w:spacing w:after="120"/>
-            </w:pPr>
-            <w:r>
-              <w:rPr>
-                <w:rStyle w:val="Strong"/>
-              </w:rPr>
-              <w:t>Shin</w:t>
-            </w:r>
-          </w:p>
-        </w:tc>
-        <w:tc>
-          <w:tcPr>
-            <w:tcW w:w="0" w:type="auto"/>
-            <w:tcMar>
-              <w:top w:w="80" w:type="dxa"/>
-              <w:left w:w="100" w:type="dxa"/>
-              <w:bottom w:w="80" w:type="dxa"/>
-              <w:right w:w="100" w:type="dxa"/>
-            </w:tcMar>
-            <w:vAlign w:val="center"/>
-          </w:tcPr>
-          <w:p>
-            <w:pPr>
-              <w:spacing w:after="120"/>
-            </w:pPr>
-            <w:r>
-              <w:t>Step-by-step guide: browse tutors → choose subject and budget → request a trial → join via Google Meet.</w:t>
-            </w:r>
-          </w:p>
-        </w:tc>
-      </w:tr>
-      <w:tr>
-        <w:tc>
-          <w:tcPr>
-            <w:tcW w:w="0" w:type="auto"/>
-            <w:tcMar>
-              <w:top w:w="80" w:type="dxa"/>
-              <w:left w:w="100" w:type="dxa"/>
-              <w:bottom w:w="80" w:type="dxa"/>
-              <w:right w:w="100" w:type="dxa"/>
-            </w:tcMar>
-            <w:vAlign w:val="center"/>
-          </w:tcPr>
-          <w:p>
-            <w:pPr>
-              <w:spacing w:after="120"/>
-            </w:pPr>
-            <w:r>
-              <w:rPr>
-                <w:rStyle w:val="Strong"/>
-              </w:rPr>
-              <w:t>Contact Us</w:t>
-            </w:r>
-          </w:p>
-        </w:tc>
-        <w:tc>
-          <w:tcPr>
-            <w:tcW w:w="0" w:type="auto"/>
-            <w:tcMar>
-              <w:top w:w="80" w:type="dxa"/>
-              <w:left w:w="100" w:type="dxa"/>
-              <w:bottom w:w="80" w:type="dxa"/>
-              <w:right w:w="100" w:type="dxa"/>
-            </w:tcMar>
-            <w:vAlign w:val="center"/>
-          </w:tcPr>
-          <w:p>
-            <w:pPr>
-              <w:spacing w:after="120"/>
-            </w:pPr>
-            <w:r>
-              <w:rPr>
-                <w:rStyle w:val="Strong"/>
-              </w:rPr>
-              <w:t>Kalai</w:t>
-            </w:r>
-          </w:p>
-        </w:tc>
-        <w:tc>
-          <w:tcPr>
-            <w:tcW w:w="0" w:type="auto"/>
-            <w:tcMar>
-              <w:top w:w="80" w:type="dxa"/>
-              <w:left w:w="100" w:type="dxa"/>
-              <w:bottom w:w="80" w:type="dxa"/>
-              <w:right w:w="100" w:type="dxa"/>
-            </w:tcMar>
-            <w:vAlign w:val="center"/>
-          </w:tcPr>
-          <w:p>
-            <w:pPr>
-              <w:spacing w:after="120"/>
-            </w:pPr>
-            <w:r>
-              <w:t>General enquiry form that reuses validation patterns from the Sign-Up page.</w:t>
-            </w:r>
-          </w:p>
-        </w:tc>
-      </w:tr>
-      <w:tr>
-        <w:tc>
-          <w:tcPr>
-            <w:tcW w:w="0" w:type="auto"/>
-            <w:tcMar>
-              <w:top w:w="80" w:type="dxa"/>
-              <w:left w:w="100" w:type="dxa"/>
-              <w:bottom w:w="80" w:type="dxa"/>
-              <w:right w:w="100" w:type="dxa"/>
-            </w:tcMar>
-            <w:vAlign w:val="center"/>
-          </w:tcPr>
-          <w:p>
-            <w:pPr>
-              <w:spacing w:after="120"/>
-            </w:pPr>
-            <w:r>
-              <w:rPr>
-                <w:rStyle w:val="Strong"/>
-              </w:rPr>
-              <w:t>Shortlist</w:t>
-            </w:r>
-          </w:p>
-        </w:tc>
-        <w:tc>
-          <w:tcPr>
-            <w:tcW w:w="0" w:type="auto"/>
-            <w:tcMar>
-              <w:top w:w="80" w:type="dxa"/>
-              <w:left w:w="100" w:type="dxa"/>
-              <w:bottom w:w="80" w:type="dxa"/>
-              <w:right w:w="100" w:type="dxa"/>
-            </w:tcMar>
-            <w:vAlign w:val="center"/>
-          </w:tcPr>
-          <w:p>
-            <w:pPr>
-              <w:spacing w:after="120"/>
-            </w:pPr>
-            <w:r>
-              <w:rPr>
-                <w:rStyle w:val="Strong"/>
-              </w:rPr>
-              <w:t>Kalai</w:t>
-            </w:r>
-          </w:p>
-        </w:tc>
-        <w:tc>
-          <w:tcPr>
-            <w:tcW w:w="0" w:type="auto"/>
-            <w:tcMar>
-              <w:top w:w="80" w:type="dxa"/>
-              <w:left w:w="100" w:type="dxa"/>
-              <w:bottom w:w="80" w:type="dxa"/>
-              <w:right w:w="100" w:type="dxa"/>
-            </w:tcMar>
-            <w:vAlign w:val="center"/>
-          </w:tcPr>
-          <w:p>
-            <w:pPr>
-              <w:spacing w:after="120"/>
-            </w:pPr>
-            <w:r>
-              <w:t>Displays tutors that the user has shortlisted for easy comparison and future booking.</w:t>
-            </w:r>
-          </w:p>
-        </w:tc>
-      </w:tr>
-      <w:tr>
-        <w:trPr>
-          <w:trHeight w:val="20"/>
-        </w:trPr>
-        <w:tc>
-          <w:tcPr>
-            <w:tcW w:w="0" w:type="auto"/>
-            <w:tcMar>
-              <w:top w:w="80" w:type="dxa"/>
-              <w:left w:w="100" w:type="dxa"/>
-              <w:bottom w:w="80" w:type="dxa"/>
-              <w:right w:w="100" w:type="dxa"/>
-            </w:tcMar>
-            <w:vAlign w:val="center"/>
-          </w:tcPr>
-          <w:p>
-            <w:pPr>
-              <w:spacing w:after="120"/>
-            </w:pPr>
-            <w:r>
-              <w:rPr>
-                <w:rStyle w:val="Strong"/>
-              </w:rPr>
-              <w:t>Testimonials / Success Stories</w:t>
-            </w:r>
-          </w:p>
-        </w:tc>
-        <w:tc>
-          <w:tcPr>
-            <w:tcW w:w="0" w:type="auto"/>
-            <w:tcMar>
-              <w:top w:w="80" w:type="dxa"/>
-              <w:left w:w="100" w:type="dxa"/>
-              <w:bottom w:w="80" w:type="dxa"/>
-              <w:right w:w="100" w:type="dxa"/>
-            </w:tcMar>
-            <w:vAlign w:val="center"/>
-          </w:tcPr>
-          <w:p>
-            <w:pPr>
-              <w:spacing w:after="120"/>
-            </w:pPr>
-            <w:r>
-              <w:rPr>
-                <w:rStyle w:val="Strong"/>
-              </w:rPr>
-              <w:t>Kalai</w:t>
-            </w:r>
-          </w:p>
-        </w:tc>
-        <w:tc>
-          <w:tcPr>
-            <w:tcW w:w="0" w:type="auto"/>
-            <w:tcMar>
-              <w:top w:w="80" w:type="dxa"/>
-              <w:left w:w="100" w:type="dxa"/>
-              <w:bottom w:w="80" w:type="dxa"/>
-              <w:right w:w="100" w:type="dxa"/>
-            </w:tcMar>
-            <w:vAlign w:val="center"/>
-          </w:tcPr>
-          <w:p>
-            <w:pPr>
-              <w:spacing w:after="120"/>
-            </w:pPr>
-            <w:r>
-              <w:t>Carousel of student success stories and feedback from parents.</w:t>
-            </w:r>
-          </w:p>
-        </w:tc>
-      </w:tr>
-    </w:tbl>
     <w:p>
       <w:pPr>
         <w:pBdr>
@@ -1729,11 +799,11 @@
           </w:p>
           <w:p>
             <w:r>
-              <w:t xml:space="preserve">One of the main changes made to the original plan was altering the website’s colour scheme. Initially, the background was plain white, but this was updated to teal to create a more engaging and visually appealing design. This change was necessary because colour strongly influences user perception and emotion. While white can feel minimalistic, it sometimes appears too stark or clinical. Teal, on the other hand, conveys freshness and calmness, which enhances the overall user experience. The impact of this adjustment is clear: it improves readability, strengthens brand identity, and makes the site feel more professional and inviting. Although the change does not affect technical performance, it positively influences how long users stay on the site </w:t>
+              <w:t xml:space="preserve">One of the main changes made to the original plan was altering the website’s colour scheme. Initially, the background was plain white, but this was updated to teal to create a more engaging and visually appealing design. This change was necessary because colour strongly influences user perception and emotion. While white can feel minimalistic, it sometimes appears too stark or clinical. Teal, on the other hand, conveys freshness and calmness, which enhances the overall user experience. The impact of this adjustment is clear: it improves readability, strengthens brand identity, </w:t>
             </w:r>
             <w:r>
               <w:lastRenderedPageBreak/>
-              <w:t>and how they interact with its features.</w:t>
+              <w:t>and makes the site feel more professional and inviting. Although the change does not affect technical performance, it positively influences how long users stay on the site and how they interact with its features.</w:t>
             </w:r>
             <w:r>
               <w:t xml:space="preserve"> </w:t>
@@ -2464,7 +1534,7 @@
                 <w:noProof/>
               </w:rPr>
               <w:drawing>
-                <wp:inline distT="0" distB="0" distL="0" distR="0" wp14:anchorId="05AAFC25" wp14:editId="3641F074">
+                <wp:inline distT="0" distB="0" distL="0" distR="0" wp14:anchorId="05AAFC25" wp14:editId="39C0CEDD">
                   <wp:extent cx="5731510" cy="4111625"/>
                   <wp:effectExtent l="0" t="0" r="2540" b="3175"/>
                   <wp:docPr id="1406413326" name="Picture 4"/>
@@ -2546,7 +1616,7 @@
               </w:rPr>
               <w:lastRenderedPageBreak/>
               <w:drawing>
-                <wp:inline distT="0" distB="0" distL="0" distR="0" wp14:anchorId="39B6BDA9" wp14:editId="3D2E5A10">
+                <wp:inline distT="0" distB="0" distL="0" distR="0" wp14:anchorId="39B6BDA9" wp14:editId="4835245D">
                   <wp:extent cx="5731510" cy="2708910"/>
                   <wp:effectExtent l="0" t="0" r="2540" b="0"/>
                   <wp:docPr id="1310240371" name="Picture 5"/>
@@ -2813,7 +1883,6 @@
         <w:docPartUnique/>
       </w:docPartObj>
     </w:sdtPr>
-    <w:sdtEndPr/>
     <w:sdtContent>
       <w:sdt>
         <w:sdtPr>
@@ -2823,7 +1892,6 @@
             <w:docPartUnique/>
           </w:docPartObj>
         </w:sdtPr>
-        <w:sdtEndPr/>
         <w:sdtContent>
           <w:p>
             <w:pPr>
@@ -7834,6 +6902,7 @@
   <w:style w:type="character" w:default="1" w:styleId="DefaultParagraphFont">
     <w:name w:val="Default Paragraph Font"/>
     <w:uiPriority w:val="1"/>
+    <w:semiHidden/>
     <w:unhideWhenUsed/>
   </w:style>
   <w:style w:type="table" w:default="1" w:styleId="TableNormal">
@@ -8574,6 +7643,28 @@
 </file>
 
 <file path=customXml/item1.xml><?xml version="1.0" encoding="utf-8"?>
+<p:properties xmlns:p="http://schemas.microsoft.com/office/2006/metadata/properties" xmlns:xsi="http://www.w3.org/2001/XMLSchema-instance" xmlns:pc="http://schemas.microsoft.com/office/infopath/2007/PartnerControls">
+  <documentManagement>
+    <_ip_UnifiedCompliancePolicyUIAction xmlns="http://schemas.microsoft.com/sharepoint/v3" xsi:nil="true"/>
+    <lcf76f155ced4ddcb4097134ff3c332f xmlns="b7fad248-bdcd-4271-9916-809a465982f7">
+      <Terms xmlns="http://schemas.microsoft.com/office/infopath/2007/PartnerControls"/>
+    </lcf76f155ced4ddcb4097134ff3c332f>
+    <_ip_UnifiedCompliancePolicyProperties xmlns="http://schemas.microsoft.com/sharepoint/v3" xsi:nil="true"/>
+    <TaxCatchAll xmlns="02435ef8-874b-49fb-b034-023fbc1b0e17" xsi:nil="true"/>
+  </documentManagement>
+</p:properties>
+</file>
+
+<file path=customXml/item2.xml><?xml version="1.0" encoding="utf-8"?>
+<?mso-contentType ?>
+<FormTemplates xmlns="http://schemas.microsoft.com/sharepoint/v3/contenttype/forms">
+  <Display>DocumentLibraryForm</Display>
+  <Edit>DocumentLibraryForm</Edit>
+  <New>DocumentLibraryForm</New>
+</FormTemplates>
+</file>
+
+<file path=customXml/item3.xml><?xml version="1.0" encoding="utf-8"?>
 <ct:contentTypeSchema xmlns:ct="http://schemas.microsoft.com/office/2006/metadata/contentType" xmlns:ma="http://schemas.microsoft.com/office/2006/metadata/properties/metaAttributes" ct:_="" ma:_="" ma:contentTypeName="Document" ma:contentTypeID="0x01010095B83DA6990E41418BCDB3837731DDD9" ma:contentTypeVersion="12" ma:contentTypeDescription="Create a new document." ma:contentTypeScope="" ma:versionID="9a0e40b26489cf95b92c0935470f1e05">
   <xsd:schema xmlns:xsd="http://www.w3.org/2001/XMLSchema" xmlns:xs="http://www.w3.org/2001/XMLSchema" xmlns:p="http://schemas.microsoft.com/office/2006/metadata/properties" xmlns:ns1="http://schemas.microsoft.com/sharepoint/v3" xmlns:ns2="b7fad248-bdcd-4271-9916-809a465982f7" xmlns:ns3="02435ef8-874b-49fb-b034-023fbc1b0e17" targetNamespace="http://schemas.microsoft.com/office/2006/metadata/properties" ma:root="true" ma:fieldsID="f5cd93c5e221519b9b0b4981d98a568c" ns1:_="" ns2:_="" ns3:_="">
     <xsd:import namespace="http://schemas.microsoft.com/sharepoint/v3"/>
@@ -8779,29 +7870,27 @@
 </ct:contentTypeSchema>
 </file>
 
-<file path=customXml/item2.xml><?xml version="1.0" encoding="utf-8"?>
-<?mso-contentType ?>
-<FormTemplates xmlns="http://schemas.microsoft.com/sharepoint/v3/contenttype/forms">
-  <Display>DocumentLibraryForm</Display>
-  <Edit>DocumentLibraryForm</Edit>
-  <New>DocumentLibraryForm</New>
-</FormTemplates>
+<file path=customXml/itemProps1.xml><?xml version="1.0" encoding="utf-8"?>
+<ds:datastoreItem xmlns:ds="http://schemas.openxmlformats.org/officeDocument/2006/customXml" ds:itemID="{451C2406-06F5-4301-9967-C40BCABE7AD8}">
+  <ds:schemaRefs>
+    <ds:schemaRef ds:uri="http://schemas.microsoft.com/office/2006/metadata/properties"/>
+    <ds:schemaRef ds:uri="http://schemas.microsoft.com/office/infopath/2007/PartnerControls"/>
+    <ds:schemaRef ds:uri="http://schemas.microsoft.com/sharepoint/v3"/>
+    <ds:schemaRef ds:uri="b7fad248-bdcd-4271-9916-809a465982f7"/>
+    <ds:schemaRef ds:uri="02435ef8-874b-49fb-b034-023fbc1b0e17"/>
+  </ds:schemaRefs>
+</ds:datastoreItem>
 </file>
 
-<file path=customXml/item3.xml><?xml version="1.0" encoding="utf-8"?>
-<p:properties xmlns:p="http://schemas.microsoft.com/office/2006/metadata/properties" xmlns:xsi="http://www.w3.org/2001/XMLSchema-instance" xmlns:pc="http://schemas.microsoft.com/office/infopath/2007/PartnerControls">
-  <documentManagement>
-    <_ip_UnifiedCompliancePolicyUIAction xmlns="http://schemas.microsoft.com/sharepoint/v3" xsi:nil="true"/>
-    <lcf76f155ced4ddcb4097134ff3c332f xmlns="b7fad248-bdcd-4271-9916-809a465982f7">
-      <Terms xmlns="http://schemas.microsoft.com/office/infopath/2007/PartnerControls"/>
-    </lcf76f155ced4ddcb4097134ff3c332f>
-    <_ip_UnifiedCompliancePolicyProperties xmlns="http://schemas.microsoft.com/sharepoint/v3" xsi:nil="true"/>
-    <TaxCatchAll xmlns="02435ef8-874b-49fb-b034-023fbc1b0e17" xsi:nil="true"/>
-  </documentManagement>
-</p:properties>
+<file path=customXml/itemProps2.xml><?xml version="1.0" encoding="utf-8"?>
+<ds:datastoreItem xmlns:ds="http://schemas.openxmlformats.org/officeDocument/2006/customXml" ds:itemID="{891417BF-93F5-4F68-A276-BE80032FE8B6}">
+  <ds:schemaRefs>
+    <ds:schemaRef ds:uri="http://schemas.microsoft.com/sharepoint/v3/contenttype/forms"/>
+  </ds:schemaRefs>
+</ds:datastoreItem>
 </file>
 
-<file path=customXml/itemProps1.xml><?xml version="1.0" encoding="utf-8"?>
+<file path=customXml/itemProps3.xml><?xml version="1.0" encoding="utf-8"?>
 <ds:datastoreItem xmlns:ds="http://schemas.openxmlformats.org/officeDocument/2006/customXml" ds:itemID="{C936C116-FB31-4FEA-9B17-D53394B2065A}">
   <ds:schemaRefs>
     <ds:schemaRef ds:uri="http://schemas.microsoft.com/office/2006/metadata/contentType"/>
@@ -8819,24 +7908,4 @@
     <ds:schemaRef ds:uri="http://schemas.microsoft.com/internal/obd"/>
   </ds:schemaRefs>
 </ds:datastoreItem>
-</file>
-
-<file path=customXml/itemProps2.xml><?xml version="1.0" encoding="utf-8"?>
-<ds:datastoreItem xmlns:ds="http://schemas.openxmlformats.org/officeDocument/2006/customXml" ds:itemID="{891417BF-93F5-4F68-A276-BE80032FE8B6}">
-  <ds:schemaRefs>
-    <ds:schemaRef ds:uri="http://schemas.microsoft.com/sharepoint/v3/contenttype/forms"/>
-  </ds:schemaRefs>
-</ds:datastoreItem>
-</file>
-
-<file path=customXml/itemProps3.xml><?xml version="1.0" encoding="utf-8"?>
-<ds:datastoreItem xmlns:ds="http://schemas.openxmlformats.org/officeDocument/2006/customXml" ds:itemID="{451C2406-06F5-4301-9967-C40BCABE7AD8}">
-  <ds:schemaRefs>
-    <ds:schemaRef ds:uri="http://schemas.microsoft.com/office/2006/metadata/properties"/>
-    <ds:schemaRef ds:uri="http://schemas.microsoft.com/office/infopath/2007/PartnerControls"/>
-    <ds:schemaRef ds:uri="http://schemas.microsoft.com/sharepoint/v3"/>
-    <ds:schemaRef ds:uri="b7fad248-bdcd-4271-9916-809a465982f7"/>
-    <ds:schemaRef ds:uri="02435ef8-874b-49fb-b034-023fbc1b0e17"/>
-  </ds:schemaRefs>
-</ds:datastoreItem>
 </file>
</xml_diff>

<commit_message>
docs kang zi xuan
</commit_message>
<xml_diff>
--- a/docs/DCITP1A04_RJ_KangZiXuan.docx
+++ b/docs/DCITP1A04_RJ_KangZiXuan.docx
@@ -465,936 +465,6 @@
         <w:t>the wordcount.</w:t>
       </w:r>
     </w:p>
-    <w:tbl>
-      <w:tblPr>
-        <w:tblW w:w="5000" w:type="pct"/>
-        <w:tblBorders>
-          <w:top w:val="single" w:sz="4" w:space="0" w:color="auto"/>
-          <w:left w:val="single" w:sz="4" w:space="0" w:color="auto"/>
-          <w:bottom w:val="single" w:sz="4" w:space="0" w:color="auto"/>
-          <w:right w:val="single" w:sz="4" w:space="0" w:color="auto"/>
-          <w:insideH w:val="single" w:sz="4" w:space="0" w:color="auto"/>
-          <w:insideV w:val="single" w:sz="4" w:space="0" w:color="auto"/>
-        </w:tblBorders>
-        <w:tblCellMar>
-          <w:left w:w="10" w:type="dxa"/>
-          <w:right w:w="10" w:type="dxa"/>
-        </w:tblCellMar>
-        <w:tblLook w:val="0000" w:firstRow="0" w:lastRow="0" w:firstColumn="0" w:lastColumn="0" w:noHBand="0" w:noVBand="0"/>
-      </w:tblPr>
-      <w:tblGrid>
-        <w:gridCol w:w="2254"/>
-        <w:gridCol w:w="1352"/>
-        <w:gridCol w:w="5410"/>
-      </w:tblGrid>
-      <w:tr>
-        <w:tc>
-          <w:tcPr>
-            <w:tcW w:w="1250" w:type="pct"/>
-            <w:shd w:val="clear" w:color="auto" w:fill="E8E8E8" w:themeFill="background2"/>
-            <w:tcMar>
-              <w:top w:w="80" w:type="dxa"/>
-              <w:left w:w="100" w:type="dxa"/>
-              <w:bottom w:w="80" w:type="dxa"/>
-              <w:right w:w="100" w:type="dxa"/>
-            </w:tcMar>
-            <w:vAlign w:val="center"/>
-          </w:tcPr>
-          <w:p>
-            <w:pPr>
-              <w:spacing w:after="120"/>
-            </w:pPr>
-            <w:r>
-              <w:rPr>
-                <w:rStyle w:val="Strong"/>
-              </w:rPr>
-              <w:t>Page</w:t>
-            </w:r>
-          </w:p>
-        </w:tc>
-        <w:tc>
-          <w:tcPr>
-            <w:tcW w:w="750" w:type="pct"/>
-            <w:shd w:val="clear" w:color="auto" w:fill="E8E8E8" w:themeFill="background2"/>
-            <w:tcMar>
-              <w:top w:w="80" w:type="dxa"/>
-              <w:left w:w="100" w:type="dxa"/>
-              <w:bottom w:w="80" w:type="dxa"/>
-              <w:right w:w="100" w:type="dxa"/>
-            </w:tcMar>
-            <w:vAlign w:val="center"/>
-          </w:tcPr>
-          <w:p>
-            <w:pPr>
-              <w:spacing w:after="120"/>
-            </w:pPr>
-            <w:r>
-              <w:rPr>
-                <w:rStyle w:val="Strong"/>
-              </w:rPr>
-              <w:t>Owner</w:t>
-            </w:r>
-          </w:p>
-        </w:tc>
-        <w:tc>
-          <w:tcPr>
-            <w:tcW w:w="3000" w:type="pct"/>
-            <w:shd w:val="clear" w:color="auto" w:fill="E8E8E8" w:themeFill="background2"/>
-            <w:tcMar>
-              <w:top w:w="80" w:type="dxa"/>
-              <w:left w:w="100" w:type="dxa"/>
-              <w:bottom w:w="80" w:type="dxa"/>
-              <w:right w:w="100" w:type="dxa"/>
-            </w:tcMar>
-            <w:vAlign w:val="center"/>
-          </w:tcPr>
-          <w:p>
-            <w:pPr>
-              <w:spacing w:after="120"/>
-            </w:pPr>
-            <w:r>
-              <w:rPr>
-                <w:rStyle w:val="Strong"/>
-              </w:rPr>
-              <w:t>Key content / purpose</w:t>
-            </w:r>
-          </w:p>
-        </w:tc>
-      </w:tr>
-      <w:tr>
-        <w:tc>
-          <w:tcPr>
-            <w:tcW w:w="0" w:type="auto"/>
-            <w:tcMar>
-              <w:top w:w="80" w:type="dxa"/>
-              <w:left w:w="100" w:type="dxa"/>
-              <w:bottom w:w="80" w:type="dxa"/>
-              <w:right w:w="100" w:type="dxa"/>
-            </w:tcMar>
-            <w:vAlign w:val="center"/>
-          </w:tcPr>
-          <w:p>
-            <w:pPr>
-              <w:spacing w:after="120"/>
-            </w:pPr>
-            <w:r>
-              <w:rPr>
-                <w:rStyle w:val="Strong"/>
-              </w:rPr>
-              <w:t xml:space="preserve">Home </w:t>
-            </w:r>
-          </w:p>
-        </w:tc>
-        <w:tc>
-          <w:tcPr>
-            <w:tcW w:w="0" w:type="auto"/>
-            <w:tcMar>
-              <w:top w:w="80" w:type="dxa"/>
-              <w:left w:w="100" w:type="dxa"/>
-              <w:bottom w:w="80" w:type="dxa"/>
-              <w:right w:w="100" w:type="dxa"/>
-            </w:tcMar>
-            <w:vAlign w:val="center"/>
-          </w:tcPr>
-          <w:p>
-            <w:pPr>
-              <w:spacing w:after="120"/>
-            </w:pPr>
-            <w:r>
-              <w:rPr>
-                <w:rStyle w:val="Strong"/>
-              </w:rPr>
-              <w:t>Elisa</w:t>
-            </w:r>
-          </w:p>
-        </w:tc>
-        <w:tc>
-          <w:tcPr>
-            <w:tcW w:w="0" w:type="auto"/>
-            <w:tcMar>
-              <w:top w:w="80" w:type="dxa"/>
-              <w:left w:w="100" w:type="dxa"/>
-              <w:bottom w:w="80" w:type="dxa"/>
-              <w:right w:w="100" w:type="dxa"/>
-            </w:tcMar>
-            <w:vAlign w:val="center"/>
-          </w:tcPr>
-          <w:p>
-            <w:pPr>
-              <w:spacing w:after="120"/>
-            </w:pPr>
-            <w:r>
-              <w:t>Mission statement, snapshot of 3 featured tutors, "How it Works" teaser, sign-up CTA.</w:t>
-            </w:r>
-          </w:p>
-        </w:tc>
-      </w:tr>
-      <w:tr>
-        <w:tc>
-          <w:tcPr>
-            <w:tcW w:w="0" w:type="auto"/>
-            <w:tcMar>
-              <w:top w:w="80" w:type="dxa"/>
-              <w:left w:w="100" w:type="dxa"/>
-              <w:bottom w:w="80" w:type="dxa"/>
-              <w:right w:w="100" w:type="dxa"/>
-            </w:tcMar>
-            <w:vAlign w:val="center"/>
-          </w:tcPr>
-          <w:p>
-            <w:pPr>
-              <w:spacing w:after="120"/>
-            </w:pPr>
-            <w:r>
-              <w:rPr>
-                <w:rStyle w:val="Strong"/>
-              </w:rPr>
-              <w:t>Sessions</w:t>
-            </w:r>
-          </w:p>
-        </w:tc>
-        <w:tc>
-          <w:tcPr>
-            <w:tcW w:w="0" w:type="auto"/>
-            <w:tcMar>
-              <w:top w:w="80" w:type="dxa"/>
-              <w:left w:w="100" w:type="dxa"/>
-              <w:bottom w:w="80" w:type="dxa"/>
-              <w:right w:w="100" w:type="dxa"/>
-            </w:tcMar>
-            <w:vAlign w:val="center"/>
-          </w:tcPr>
-          <w:p>
-            <w:pPr>
-              <w:spacing w:after="120" w:line="259" w:lineRule="auto"/>
-            </w:pPr>
-            <w:r>
-              <w:rPr>
-                <w:rStyle w:val="Strong"/>
-              </w:rPr>
-              <w:t>Elisa</w:t>
-            </w:r>
-          </w:p>
-        </w:tc>
-        <w:tc>
-          <w:tcPr>
-            <w:tcW w:w="0" w:type="auto"/>
-            <w:tcMar>
-              <w:top w:w="80" w:type="dxa"/>
-              <w:left w:w="100" w:type="dxa"/>
-              <w:bottom w:w="80" w:type="dxa"/>
-              <w:right w:w="100" w:type="dxa"/>
-            </w:tcMar>
-            <w:vAlign w:val="center"/>
-          </w:tcPr>
-          <w:p>
-            <w:pPr>
-              <w:spacing w:after="120"/>
-            </w:pPr>
-            <w:r>
-              <w:t>Displays the user's booked or upcoming tutoring sessions, including schedule and meeting details.</w:t>
-            </w:r>
-          </w:p>
-        </w:tc>
-      </w:tr>
-      <w:tr>
-        <w:tc>
-          <w:tcPr>
-            <w:tcW w:w="0" w:type="auto"/>
-            <w:tcMar>
-              <w:top w:w="80" w:type="dxa"/>
-              <w:left w:w="100" w:type="dxa"/>
-              <w:bottom w:w="80" w:type="dxa"/>
-              <w:right w:w="100" w:type="dxa"/>
-            </w:tcMar>
-            <w:vAlign w:val="center"/>
-          </w:tcPr>
-          <w:p>
-            <w:pPr>
-              <w:spacing w:after="120"/>
-            </w:pPr>
-            <w:r>
-              <w:rPr>
-                <w:rStyle w:val="Strong"/>
-              </w:rPr>
-              <w:t>Profile</w:t>
-            </w:r>
-          </w:p>
-        </w:tc>
-        <w:tc>
-          <w:tcPr>
-            <w:tcW w:w="0" w:type="auto"/>
-            <w:tcMar>
-              <w:top w:w="80" w:type="dxa"/>
-              <w:left w:w="100" w:type="dxa"/>
-              <w:bottom w:w="80" w:type="dxa"/>
-              <w:right w:w="100" w:type="dxa"/>
-            </w:tcMar>
-            <w:vAlign w:val="center"/>
-          </w:tcPr>
-          <w:p>
-            <w:pPr>
-              <w:spacing w:after="120" w:line="259" w:lineRule="auto"/>
-            </w:pPr>
-            <w:r>
-              <w:rPr>
-                <w:rStyle w:val="Strong"/>
-              </w:rPr>
-              <w:t>Elisa</w:t>
-            </w:r>
-          </w:p>
-        </w:tc>
-        <w:tc>
-          <w:tcPr>
-            <w:tcW w:w="0" w:type="auto"/>
-            <w:tcMar>
-              <w:top w:w="80" w:type="dxa"/>
-              <w:left w:w="100" w:type="dxa"/>
-              <w:bottom w:w="80" w:type="dxa"/>
-              <w:right w:w="100" w:type="dxa"/>
-            </w:tcMar>
-            <w:vAlign w:val="center"/>
-          </w:tcPr>
-          <w:p>
-            <w:pPr>
-              <w:spacing w:after="120"/>
-            </w:pPr>
-            <w:r>
-              <w:t>User profile page where students/parents can view and update their personal information and account details.</w:t>
-            </w:r>
-          </w:p>
-        </w:tc>
-      </w:tr>
-      <w:tr>
-        <w:tc>
-          <w:tcPr>
-            <w:tcW w:w="0" w:type="auto"/>
-            <w:tcMar>
-              <w:top w:w="80" w:type="dxa"/>
-              <w:left w:w="100" w:type="dxa"/>
-              <w:bottom w:w="80" w:type="dxa"/>
-              <w:right w:w="100" w:type="dxa"/>
-            </w:tcMar>
-            <w:vAlign w:val="center"/>
-          </w:tcPr>
-          <w:p>
-            <w:pPr>
-              <w:spacing w:after="120"/>
-            </w:pPr>
-            <w:r>
-              <w:rPr>
-                <w:rStyle w:val="Strong"/>
-              </w:rPr>
-              <w:t>Tutor Profile</w:t>
-            </w:r>
-          </w:p>
-        </w:tc>
-        <w:tc>
-          <w:tcPr>
-            <w:tcW w:w="0" w:type="auto"/>
-            <w:tcMar>
-              <w:top w:w="80" w:type="dxa"/>
-              <w:left w:w="100" w:type="dxa"/>
-              <w:bottom w:w="80" w:type="dxa"/>
-              <w:right w:w="100" w:type="dxa"/>
-            </w:tcMar>
-            <w:vAlign w:val="center"/>
-          </w:tcPr>
-          <w:p>
-            <w:pPr>
-              <w:spacing w:after="120"/>
-            </w:pPr>
-            <w:r>
-              <w:rPr>
-                <w:rStyle w:val="Strong"/>
-              </w:rPr>
-              <w:t>Zi Xuan</w:t>
-            </w:r>
-          </w:p>
-        </w:tc>
-        <w:tc>
-          <w:tcPr>
-            <w:tcW w:w="0" w:type="auto"/>
-            <w:tcMar>
-              <w:top w:w="80" w:type="dxa"/>
-              <w:left w:w="100" w:type="dxa"/>
-              <w:bottom w:w="80" w:type="dxa"/>
-              <w:right w:w="100" w:type="dxa"/>
-            </w:tcMar>
-            <w:vAlign w:val="center"/>
-          </w:tcPr>
-          <w:p>
-            <w:pPr>
-              <w:spacing w:after="120"/>
-            </w:pPr>
-            <w:r>
-              <w:t>Full tutor bio, qualifications, availability, and "Request This Tutor" button.</w:t>
-            </w:r>
-          </w:p>
-        </w:tc>
-      </w:tr>
-      <w:tr>
-        <w:tc>
-          <w:tcPr>
-            <w:tcW w:w="0" w:type="auto"/>
-            <w:tcMar>
-              <w:top w:w="80" w:type="dxa"/>
-              <w:left w:w="100" w:type="dxa"/>
-              <w:bottom w:w="80" w:type="dxa"/>
-              <w:right w:w="100" w:type="dxa"/>
-            </w:tcMar>
-            <w:vAlign w:val="center"/>
-          </w:tcPr>
-          <w:p>
-            <w:pPr>
-              <w:spacing w:after="120"/>
-            </w:pPr>
-            <w:r>
-              <w:rPr>
-                <w:rStyle w:val="Strong"/>
-              </w:rPr>
-              <w:t>About Us</w:t>
-            </w:r>
-          </w:p>
-        </w:tc>
-        <w:tc>
-          <w:tcPr>
-            <w:tcW w:w="0" w:type="auto"/>
-            <w:tcMar>
-              <w:top w:w="80" w:type="dxa"/>
-              <w:left w:w="100" w:type="dxa"/>
-              <w:bottom w:w="80" w:type="dxa"/>
-              <w:right w:w="100" w:type="dxa"/>
-            </w:tcMar>
-            <w:vAlign w:val="center"/>
-          </w:tcPr>
-          <w:p>
-            <w:pPr>
-              <w:spacing w:after="120"/>
-            </w:pPr>
-            <w:r>
-              <w:rPr>
-                <w:rStyle w:val="Strong"/>
-              </w:rPr>
-              <w:t>Zi Xuan</w:t>
-            </w:r>
-          </w:p>
-        </w:tc>
-        <w:tc>
-          <w:tcPr>
-            <w:tcW w:w="0" w:type="auto"/>
-            <w:tcMar>
-              <w:top w:w="80" w:type="dxa"/>
-              <w:left w:w="100" w:type="dxa"/>
-              <w:bottom w:w="80" w:type="dxa"/>
-              <w:right w:w="100" w:type="dxa"/>
-            </w:tcMar>
-            <w:vAlign w:val="center"/>
-          </w:tcPr>
-          <w:p>
-            <w:pPr>
-              <w:spacing w:after="120"/>
-            </w:pPr>
-            <w:r>
-              <w:t xml:space="preserve">The problem (tuition cost vs. exchange-rate advantage), team bios, and why we built </w:t>
-            </w:r>
-            <w:proofErr w:type="spellStart"/>
-            <w:r>
-              <w:t>TutorBridge</w:t>
-            </w:r>
-            <w:proofErr w:type="spellEnd"/>
-            <w:r>
-              <w:t>.</w:t>
-            </w:r>
-          </w:p>
-        </w:tc>
-      </w:tr>
-      <w:tr>
-        <w:tc>
-          <w:tcPr>
-            <w:tcW w:w="0" w:type="auto"/>
-            <w:tcMar>
-              <w:top w:w="80" w:type="dxa"/>
-              <w:left w:w="100" w:type="dxa"/>
-              <w:bottom w:w="80" w:type="dxa"/>
-              <w:right w:w="100" w:type="dxa"/>
-            </w:tcMar>
-            <w:vAlign w:val="center"/>
-          </w:tcPr>
-          <w:p>
-            <w:pPr>
-              <w:spacing w:after="120"/>
-            </w:pPr>
-            <w:r>
-              <w:rPr>
-                <w:rStyle w:val="Strong"/>
-              </w:rPr>
-              <w:t>Resources for Parents</w:t>
-            </w:r>
-          </w:p>
-        </w:tc>
-        <w:tc>
-          <w:tcPr>
-            <w:tcW w:w="0" w:type="auto"/>
-            <w:tcMar>
-              <w:top w:w="80" w:type="dxa"/>
-              <w:left w:w="100" w:type="dxa"/>
-              <w:bottom w:w="80" w:type="dxa"/>
-              <w:right w:w="100" w:type="dxa"/>
-            </w:tcMar>
-            <w:vAlign w:val="center"/>
-          </w:tcPr>
-          <w:p>
-            <w:pPr>
-              <w:spacing w:after="120"/>
-            </w:pPr>
-            <w:r>
-              <w:rPr>
-                <w:rStyle w:val="Strong"/>
-              </w:rPr>
-              <w:t>Zi Xuan</w:t>
-            </w:r>
-          </w:p>
-        </w:tc>
-        <w:tc>
-          <w:tcPr>
-            <w:tcW w:w="0" w:type="auto"/>
-            <w:tcMar>
-              <w:top w:w="80" w:type="dxa"/>
-              <w:left w:w="100" w:type="dxa"/>
-              <w:bottom w:w="80" w:type="dxa"/>
-              <w:right w:w="100" w:type="dxa"/>
-            </w:tcMar>
-            <w:vAlign w:val="center"/>
-          </w:tcPr>
-          <w:p>
-            <w:pPr>
-              <w:spacing w:after="120"/>
-            </w:pPr>
-            <w:r>
-              <w:t>Study tips, first-session preparation, and links to free educational resources.</w:t>
-            </w:r>
-          </w:p>
-        </w:tc>
-      </w:tr>
-      <w:tr>
-        <w:tc>
-          <w:tcPr>
-            <w:tcW w:w="0" w:type="auto"/>
-            <w:tcMar>
-              <w:top w:w="80" w:type="dxa"/>
-              <w:left w:w="100" w:type="dxa"/>
-              <w:bottom w:w="80" w:type="dxa"/>
-              <w:right w:w="100" w:type="dxa"/>
-            </w:tcMar>
-            <w:vAlign w:val="center"/>
-          </w:tcPr>
-          <w:p>
-            <w:pPr>
-              <w:spacing w:after="120"/>
-            </w:pPr>
-            <w:r>
-              <w:rPr>
-                <w:rStyle w:val="Strong"/>
-              </w:rPr>
-              <w:lastRenderedPageBreak/>
-              <w:t>Pricing / Currency Comparison</w:t>
-            </w:r>
-          </w:p>
-        </w:tc>
-        <w:tc>
-          <w:tcPr>
-            <w:tcW w:w="0" w:type="auto"/>
-            <w:tcMar>
-              <w:top w:w="80" w:type="dxa"/>
-              <w:left w:w="100" w:type="dxa"/>
-              <w:bottom w:w="80" w:type="dxa"/>
-              <w:right w:w="100" w:type="dxa"/>
-            </w:tcMar>
-            <w:vAlign w:val="center"/>
-          </w:tcPr>
-          <w:p>
-            <w:pPr>
-              <w:spacing w:after="120"/>
-            </w:pPr>
-            <w:r>
-              <w:rPr>
-                <w:rStyle w:val="Strong"/>
-              </w:rPr>
-              <w:t>Shin</w:t>
-            </w:r>
-          </w:p>
-        </w:tc>
-        <w:tc>
-          <w:tcPr>
-            <w:tcW w:w="0" w:type="auto"/>
-            <w:tcMar>
-              <w:top w:w="80" w:type="dxa"/>
-              <w:left w:w="100" w:type="dxa"/>
-              <w:bottom w:w="80" w:type="dxa"/>
-              <w:right w:w="100" w:type="dxa"/>
-            </w:tcMar>
-            <w:vAlign w:val="center"/>
-          </w:tcPr>
-          <w:p>
-            <w:pPr>
-              <w:spacing w:after="120"/>
-            </w:pPr>
-            <w:r>
-              <w:t>Calculator: input subject and hours → live cost comparison with local tuition rates.</w:t>
-            </w:r>
-          </w:p>
-        </w:tc>
-      </w:tr>
-      <w:tr>
-        <w:tc>
-          <w:tcPr>
-            <w:tcW w:w="0" w:type="auto"/>
-            <w:tcMar>
-              <w:top w:w="80" w:type="dxa"/>
-              <w:left w:w="100" w:type="dxa"/>
-              <w:bottom w:w="80" w:type="dxa"/>
-              <w:right w:w="100" w:type="dxa"/>
-            </w:tcMar>
-            <w:vAlign w:val="center"/>
-          </w:tcPr>
-          <w:p>
-            <w:pPr>
-              <w:spacing w:after="120"/>
-            </w:pPr>
-            <w:r>
-              <w:rPr>
-                <w:rStyle w:val="Strong"/>
-              </w:rPr>
-              <w:t>Sign-Up / Request a Tutor</w:t>
-            </w:r>
-          </w:p>
-        </w:tc>
-        <w:tc>
-          <w:tcPr>
-            <w:tcW w:w="0" w:type="auto"/>
-            <w:tcMar>
-              <w:top w:w="80" w:type="dxa"/>
-              <w:left w:w="100" w:type="dxa"/>
-              <w:bottom w:w="80" w:type="dxa"/>
-              <w:right w:w="100" w:type="dxa"/>
-            </w:tcMar>
-            <w:vAlign w:val="center"/>
-          </w:tcPr>
-          <w:p>
-            <w:pPr>
-              <w:spacing w:after="120"/>
-              <w:rPr>
-                <w:rFonts w:ascii="Calibri" w:eastAsia="Calibri" w:hAnsi="Calibri" w:cs="Calibri"/>
-                <w:sz w:val="22"/>
-                <w:szCs w:val="22"/>
-              </w:rPr>
-            </w:pPr>
-            <w:r>
-              <w:rPr>
-                <w:rStyle w:val="Strong"/>
-              </w:rPr>
-              <w:t>Shin</w:t>
-            </w:r>
-          </w:p>
-        </w:tc>
-        <w:tc>
-          <w:tcPr>
-            <w:tcW w:w="0" w:type="auto"/>
-            <w:tcMar>
-              <w:top w:w="80" w:type="dxa"/>
-              <w:left w:w="100" w:type="dxa"/>
-              <w:bottom w:w="80" w:type="dxa"/>
-              <w:right w:w="100" w:type="dxa"/>
-            </w:tcMar>
-            <w:vAlign w:val="center"/>
-          </w:tcPr>
-          <w:p>
-            <w:pPr>
-              <w:spacing w:after="120"/>
-            </w:pPr>
-            <w:r>
-              <w:t>Form for student/parent details, grade level, subject, budget, preferred time slots, with form validation.</w:t>
-            </w:r>
-          </w:p>
-        </w:tc>
-      </w:tr>
-      <w:tr>
-        <w:tc>
-          <w:tcPr>
-            <w:tcW w:w="0" w:type="auto"/>
-            <w:tcMar>
-              <w:top w:w="80" w:type="dxa"/>
-              <w:left w:w="100" w:type="dxa"/>
-              <w:bottom w:w="80" w:type="dxa"/>
-              <w:right w:w="100" w:type="dxa"/>
-            </w:tcMar>
-            <w:vAlign w:val="center"/>
-          </w:tcPr>
-          <w:p>
-            <w:pPr>
-              <w:spacing w:after="120"/>
-            </w:pPr>
-            <w:r>
-              <w:rPr>
-                <w:rStyle w:val="Strong"/>
-              </w:rPr>
-              <w:t>How It Works</w:t>
-            </w:r>
-          </w:p>
-        </w:tc>
-        <w:tc>
-          <w:tcPr>
-            <w:tcW w:w="0" w:type="auto"/>
-            <w:tcMar>
-              <w:top w:w="80" w:type="dxa"/>
-              <w:left w:w="100" w:type="dxa"/>
-              <w:bottom w:w="80" w:type="dxa"/>
-              <w:right w:w="100" w:type="dxa"/>
-            </w:tcMar>
-            <w:vAlign w:val="center"/>
-          </w:tcPr>
-          <w:p>
-            <w:pPr>
-              <w:spacing w:after="120"/>
-            </w:pPr>
-            <w:r>
-              <w:rPr>
-                <w:rStyle w:val="Strong"/>
-              </w:rPr>
-              <w:t>Shin</w:t>
-            </w:r>
-          </w:p>
-        </w:tc>
-        <w:tc>
-          <w:tcPr>
-            <w:tcW w:w="0" w:type="auto"/>
-            <w:tcMar>
-              <w:top w:w="80" w:type="dxa"/>
-              <w:left w:w="100" w:type="dxa"/>
-              <w:bottom w:w="80" w:type="dxa"/>
-              <w:right w:w="100" w:type="dxa"/>
-            </w:tcMar>
-            <w:vAlign w:val="center"/>
-          </w:tcPr>
-          <w:p>
-            <w:pPr>
-              <w:spacing w:after="120"/>
-            </w:pPr>
-            <w:r>
-              <w:t>Step-by-step guide: browse tutors → choose subject and budget → request a trial → join via Google Meet.</w:t>
-            </w:r>
-          </w:p>
-        </w:tc>
-      </w:tr>
-      <w:tr>
-        <w:tc>
-          <w:tcPr>
-            <w:tcW w:w="0" w:type="auto"/>
-            <w:tcMar>
-              <w:top w:w="80" w:type="dxa"/>
-              <w:left w:w="100" w:type="dxa"/>
-              <w:bottom w:w="80" w:type="dxa"/>
-              <w:right w:w="100" w:type="dxa"/>
-            </w:tcMar>
-            <w:vAlign w:val="center"/>
-          </w:tcPr>
-          <w:p>
-            <w:pPr>
-              <w:spacing w:after="120"/>
-            </w:pPr>
-            <w:r>
-              <w:rPr>
-                <w:rStyle w:val="Strong"/>
-              </w:rPr>
-              <w:t>Contact Us</w:t>
-            </w:r>
-          </w:p>
-        </w:tc>
-        <w:tc>
-          <w:tcPr>
-            <w:tcW w:w="0" w:type="auto"/>
-            <w:tcMar>
-              <w:top w:w="80" w:type="dxa"/>
-              <w:left w:w="100" w:type="dxa"/>
-              <w:bottom w:w="80" w:type="dxa"/>
-              <w:right w:w="100" w:type="dxa"/>
-            </w:tcMar>
-            <w:vAlign w:val="center"/>
-          </w:tcPr>
-          <w:p>
-            <w:pPr>
-              <w:spacing w:after="120"/>
-            </w:pPr>
-            <w:r>
-              <w:rPr>
-                <w:rStyle w:val="Strong"/>
-              </w:rPr>
-              <w:t>Kalai</w:t>
-            </w:r>
-          </w:p>
-        </w:tc>
-        <w:tc>
-          <w:tcPr>
-            <w:tcW w:w="0" w:type="auto"/>
-            <w:tcMar>
-              <w:top w:w="80" w:type="dxa"/>
-              <w:left w:w="100" w:type="dxa"/>
-              <w:bottom w:w="80" w:type="dxa"/>
-              <w:right w:w="100" w:type="dxa"/>
-            </w:tcMar>
-            <w:vAlign w:val="center"/>
-          </w:tcPr>
-          <w:p>
-            <w:pPr>
-              <w:spacing w:after="120"/>
-            </w:pPr>
-            <w:r>
-              <w:t>General enquiry form that reuses validation patterns from the Sign-Up page.</w:t>
-            </w:r>
-          </w:p>
-        </w:tc>
-      </w:tr>
-      <w:tr>
-        <w:tc>
-          <w:tcPr>
-            <w:tcW w:w="0" w:type="auto"/>
-            <w:tcMar>
-              <w:top w:w="80" w:type="dxa"/>
-              <w:left w:w="100" w:type="dxa"/>
-              <w:bottom w:w="80" w:type="dxa"/>
-              <w:right w:w="100" w:type="dxa"/>
-            </w:tcMar>
-            <w:vAlign w:val="center"/>
-          </w:tcPr>
-          <w:p>
-            <w:pPr>
-              <w:spacing w:after="120"/>
-            </w:pPr>
-            <w:r>
-              <w:rPr>
-                <w:rStyle w:val="Strong"/>
-              </w:rPr>
-              <w:t>Shortlist</w:t>
-            </w:r>
-          </w:p>
-        </w:tc>
-        <w:tc>
-          <w:tcPr>
-            <w:tcW w:w="0" w:type="auto"/>
-            <w:tcMar>
-              <w:top w:w="80" w:type="dxa"/>
-              <w:left w:w="100" w:type="dxa"/>
-              <w:bottom w:w="80" w:type="dxa"/>
-              <w:right w:w="100" w:type="dxa"/>
-            </w:tcMar>
-            <w:vAlign w:val="center"/>
-          </w:tcPr>
-          <w:p>
-            <w:pPr>
-              <w:spacing w:after="120"/>
-            </w:pPr>
-            <w:r>
-              <w:rPr>
-                <w:rStyle w:val="Strong"/>
-              </w:rPr>
-              <w:t>Kalai</w:t>
-            </w:r>
-          </w:p>
-        </w:tc>
-        <w:tc>
-          <w:tcPr>
-            <w:tcW w:w="0" w:type="auto"/>
-            <w:tcMar>
-              <w:top w:w="80" w:type="dxa"/>
-              <w:left w:w="100" w:type="dxa"/>
-              <w:bottom w:w="80" w:type="dxa"/>
-              <w:right w:w="100" w:type="dxa"/>
-            </w:tcMar>
-            <w:vAlign w:val="center"/>
-          </w:tcPr>
-          <w:p>
-            <w:pPr>
-              <w:spacing w:after="120"/>
-            </w:pPr>
-            <w:r>
-              <w:t>Displays tutors that the user has shortlisted for easy comparison and future booking.</w:t>
-            </w:r>
-          </w:p>
-        </w:tc>
-      </w:tr>
-      <w:tr>
-        <w:trPr>
-          <w:trHeight w:val="20"/>
-        </w:trPr>
-        <w:tc>
-          <w:tcPr>
-            <w:tcW w:w="0" w:type="auto"/>
-            <w:tcMar>
-              <w:top w:w="80" w:type="dxa"/>
-              <w:left w:w="100" w:type="dxa"/>
-              <w:bottom w:w="80" w:type="dxa"/>
-              <w:right w:w="100" w:type="dxa"/>
-            </w:tcMar>
-            <w:vAlign w:val="center"/>
-          </w:tcPr>
-          <w:p>
-            <w:pPr>
-              <w:spacing w:after="120"/>
-            </w:pPr>
-            <w:r>
-              <w:rPr>
-                <w:rStyle w:val="Strong"/>
-              </w:rPr>
-              <w:t>Testimonials / Success Stories</w:t>
-            </w:r>
-          </w:p>
-        </w:tc>
-        <w:tc>
-          <w:tcPr>
-            <w:tcW w:w="0" w:type="auto"/>
-            <w:tcMar>
-              <w:top w:w="80" w:type="dxa"/>
-              <w:left w:w="100" w:type="dxa"/>
-              <w:bottom w:w="80" w:type="dxa"/>
-              <w:right w:w="100" w:type="dxa"/>
-            </w:tcMar>
-            <w:vAlign w:val="center"/>
-          </w:tcPr>
-          <w:p>
-            <w:pPr>
-              <w:spacing w:after="120"/>
-            </w:pPr>
-            <w:r>
-              <w:rPr>
-                <w:rStyle w:val="Strong"/>
-              </w:rPr>
-              <w:t>Kalai</w:t>
-            </w:r>
-          </w:p>
-        </w:tc>
-        <w:tc>
-          <w:tcPr>
-            <w:tcW w:w="0" w:type="auto"/>
-            <w:tcMar>
-              <w:top w:w="80" w:type="dxa"/>
-              <w:left w:w="100" w:type="dxa"/>
-              <w:bottom w:w="80" w:type="dxa"/>
-              <w:right w:w="100" w:type="dxa"/>
-            </w:tcMar>
-            <w:vAlign w:val="center"/>
-          </w:tcPr>
-          <w:p>
-            <w:pPr>
-              <w:spacing w:after="120"/>
-            </w:pPr>
-            <w:r>
-              <w:t>Carousel of student success stories and feedback from parents.</w:t>
-            </w:r>
-          </w:p>
-        </w:tc>
-      </w:tr>
-    </w:tbl>
     <w:p>
       <w:pPr>
         <w:pBdr>
@@ -1721,33 +791,23 @@
               <w:t>here)</w:t>
             </w:r>
           </w:p>
-          <w:p>
-            <w:pPr>
-              <w:pStyle w:val="ListParagraph"/>
-              <w:ind w:left="0"/>
-            </w:pPr>
-          </w:p>
+          <w:p/>
           <w:p>
             <w:r>
-              <w:t xml:space="preserve">One of the main changes made to the original plan was altering the website’s colour scheme. Initially, the background was plain white, but this was updated to teal to create a more engaging and visually appealing design. This change was necessary because colour strongly influences user perception and emotion. While white can feel minimalistic, it sometimes appears too stark or clinical. Teal, on the other hand, conveys freshness and calmness, which enhances the overall user experience. The impact of this adjustment is clear: it improves readability, strengthens brand identity, and makes the site feel more professional and inviting. Although the change does not affect technical performance, it positively influences how long users stay on the site </w:t>
+              <w:t xml:space="preserve">One of the key changes we made beyond our original plan was adding a bright mode </w:t>
+            </w:r>
+            <w:r>
+              <w:t xml:space="preserve">and </w:t>
+            </w:r>
+            <w:r>
+              <w:t xml:space="preserve">dark mode toggle feature, which wasn't part of the initial scope but was introduced afterward as a UX enhancement once the core pages and shared navbar system were already built; this was necessary for accessibility and visual comfort, and to bring the site in line with the theme options users now expect from modern web apps, and implementing it also exposed a real bug, since the toggle button's click handler was originally attached via a standalone addEventListener call at the </w:t>
             </w:r>
             <w:r>
               <w:lastRenderedPageBreak/>
-              <w:t>and how they interact with its features.</w:t>
-            </w:r>
-            <w:r>
-              <w:t xml:space="preserve"> </w:t>
-            </w:r>
-            <w:r>
-              <w:t>When analyzing the trade-offs between using a front-end styling framework such as Bootstrap or Tailwind and writing custom CSS, the decision comes down to efficiency, flexibility, and maintainability. Frameworks provide prebuilt components and utility classes that speed up development and ensure consistency, which is especially useful for teams. However, they can limit design originality and sometimes add unnecessary code. Custom CSS offers complete creative freedom and leaner styles tailored to the project, but it requires more time and careful organization to maintain. In my project, using a framework improved efficiency and responsiveness, but customizing unique designs required extra effort. This choice ultimately balanced speed with maintainability, though it meant sacrificing some flexibility compared to writing CSS entirely from scratch.</w:t>
-            </w:r>
-            <w:r>
-              <w:t xml:space="preserve"> </w:t>
-            </w:r>
-            <w:r>
-              <w:t>For interactivity, I implemented form validation, which greatly improved user experience by preventing incorrect submissions and providing immediate feedback. Users are guided to correct errors before submitting, reducing frustration and ensuring cleaner data collection. To enhance this feature further, I would add clearer error messages that explain exactly what went wrong, visual cues such as highlighted fields or icons to draw attention, and accessibility improvements so that screen readers can convey the feedback effectively. These enhancements would make the interaction smoother, more inclusive, and more intuitive, ultimately strengthening usability and user satisfaction.</w:t>
+              <w:t>bottom of main.js, which ran before the button actually existed in the DOM because the navbar is built dynamically by renderNavbar(), causing the handler to silently fail until we fixed it by binding the click behavior inline within the navbar's template itself, matching the pattern already used for the hamburger menu, with the overall impact being that users now get a persistent theme choice saved via localStorage across every page, more consistent and maintainable navbar code, and negligible performance cost since toggling just swaps a data-theme attribute and a handful of CSS variables. This ties into our choice to use custom CSS built on design tokens rather than a framework like Bootstrap or Tailwind — a decision that was slower upfront, since every component such as the swipe cards, modals, and navbar had to be styled from scratch, but gave us far more design flexibility to build a distinctive visual identity, and the token system paid off directly for maintainability, since adding dark mode only required overriding a few variables in a [data-theme="dark"] block instead of hunting down hardcoded colors across the whole stylesheet, though the trade-off of not using a framework was less enforced consistency across teammates, which showed up as duplicate .navbar rules across page stylesheets that had to be cleaned up later. Evaluating dark mode as our chosen interactive feature, it improves user experience by giving users control over visual comfort and works consistently site-wide since it's centralized in the shared navbar, though its main limitations are that it defaults to light mode for every new visitor rather than respecting system preference, and the toggle lacks semantic state such as aria-pressed for screen reader users, so if enhancing it further we would detect the user's prefers-color-scheme setting as the default and add proper ARIA attributes to make the feature more accessible.</w:t>
             </w:r>
           </w:p>
+          <w:p/>
         </w:tc>
         <w:tc>
           <w:tcPr>
@@ -2082,49 +1142,7 @@
           </w:p>
           <w:p>
             <w:r>
-              <w:t xml:space="preserve">One of the main changes made to the original plan was adding a </w:t>
-            </w:r>
-            <w:r>
-              <w:rPr>
-                <w:b/>
-                <w:bCs/>
-              </w:rPr>
-              <w:t>hamburger menu toggle</w:t>
-            </w:r>
-            <w:r>
-              <w:t xml:space="preserve"> for navigation. Initially, the website used a static navigation bar, which worked fine on larger screens but became cluttered and difficult to use on mobile devices. This change was necessary to improve responsiveness and accessibility, ensuring that users on smaller screens could still navigate easily. The impact of this adjustment was significant: it streamlined the design, reduced visual clutter, and improved the overall user experience without affecting performance. By collapsing the menu into a simple icon that expands on click, the site became more modern, mobile-friendly, and intuitive.</w:t>
-            </w:r>
-            <w:r>
-              <w:t xml:space="preserve"> </w:t>
-            </w:r>
-            <w:r>
-              <w:t xml:space="preserve">The JavaScript feature that made the biggest impact was the </w:t>
-            </w:r>
-            <w:r>
-              <w:rPr>
-                <w:b/>
-                <w:bCs/>
-              </w:rPr>
-              <w:t>hamburger menu toggle</w:t>
-            </w:r>
-            <w:r>
-              <w:t xml:space="preserve"> itself. This feature enhanced usability by allowing users to access navigation links quickly without overwhelming them with options on small screens. It improved the site’s responsiveness and gave users a smoother, more interactive experience. The toggle also demonstrated effective DOM manipulation, as elements were dynamically shown or hidden based on user interaction, making the site feel more engaging and functional.</w:t>
-            </w:r>
-            <w:r>
-              <w:t xml:space="preserve"> </w:t>
-            </w:r>
-            <w:r>
-              <w:t xml:space="preserve">Thinking about forms created in class, a form is easy to complete when it has clear labels, logical grouping of fields, and real-time validation. It becomes difficult when there are too many fields, unclear instructions, or poor error messages. One improvement I would suggest is adding </w:t>
-            </w:r>
-            <w:r>
-              <w:rPr>
-                <w:b/>
-                <w:bCs/>
-              </w:rPr>
-              <w:t>inline validation with specific feedback</w:t>
-            </w:r>
-            <w:r>
-              <w:t>. For example, instead of simply saying “Invalid input,” the form could explain “Password must be at least 8 characters and include a number.” This would guide users more effectively, reduce frustration, and make the form more user-friendly. Combined with features like the hamburger menu, these improvements show how DOM and JavaScript interactivity can transform a website into a smoother, more accessible experience.</w:t>
+              <w:t>A significant change we made beyond our original plan was moving navbar and footer rendering from static, hardcoded HTML on each page to a dynamic JavaScript-driven system in main.js, since duplicated markup across pages had led to inconsistencies and CSS conflicts, such as duplicate .navbar rules fighting the shared stylesheet and the Account button rendering with invisible text on some pages, so the fix was to have every page include just an empty &lt;header id="global-navbar"&gt; and &lt;footer id="global-footer"&gt;, with JavaScript injecting the actual content at runtime via renderNavbar() and renderFooter(); we also added a dark mode toggle later in development, which required restructuring how its event listener was bound, moving from a standalone addEventListener call that failed silently because it ran before the button existed in the DOM, to an inline onclick handler set at render time instead, and the overall impact of these changes was that pages became more consistent and easier to maintain since navigation only needs to be updated in one place, though it also introduced a runtime dependency on main.js, meaning if that script fails to load, the entire navbar and footer disappear. In terms of which JavaScript feature made the biggest impact on user experience, the swipe-card interface on our "Find Your Tutor" page stands out the most, since rather than presenting tutors as a static list, JavaScript handles drag events on each card, animates the card stack through layered scale and opacity classes to create a sense of depth, displays like/nope badges based on swipe direction, and updates a shortlist saved in localStorage, which together made browsing tutors feel closer to a native mobile app than a typical directory and turned a fairly mundane task into something more engaging and interactive. Reflecting on the forms we built, such as the volunteer and tutor qualification forms, a form is easy to complete when it only asks for what's necessary, groups related fields logically using structures like our paired fieldsets for name/email and subject/level, and gives immediate, clear feedback when something is wrong, whereas forms become hard to complete when required fields aren't obviously marked, there's no inline validation so errors only surface after submission, or instructions are vague, as with our volunteer form not clarifying upfront how long the diagnostic paper takes; one improvement I'd suggest is adding real-time inline validation using JavaScript, tied to the .field-error and .error-msg classes already defined in our stylesheet but not yet wired up, so errors are caught and explained as the user fills the form rather than after submission, which reduces frustration and gives clearer guidance on what to fix.</w:t>
             </w:r>
           </w:p>
           <w:p>
@@ -2238,16 +1256,7 @@
           <w:iCs/>
           <w:color w:val="0070C0"/>
         </w:rPr>
-        <w:t xml:space="preserve">Choose one example where you used AI to help with coding for your website. Show the original AI-generated snippet and your modified version. Explain what you </w:t>
-      </w:r>
-      <w:r>
-        <w:rPr>
-          <w:i/>
-          <w:iCs/>
-          <w:color w:val="0070C0"/>
-        </w:rPr>
-        <w:lastRenderedPageBreak/>
-        <w:t>changed and why. How did your changes make the code better or fit your project needs?</w:t>
+        <w:t>Choose one example where you used AI to help with coding for your website. Show the original AI-generated snippet and your modified version. Explain what you changed and why. How did your changes make the code better or fit your project needs?</w:t>
       </w:r>
     </w:p>
     <w:p>
@@ -2361,149 +1370,17 @@
               <w:ind w:left="0"/>
             </w:pPr>
             <w:r>
-              <w:t>I used AI  to mainly support coding tasks and problem-solving with javascript and DOM interactivity</w:t>
+              <w:t xml:space="preserve">I used AI (Claude) mainly to help debug and refine JavaScript issues that were hard to catch just by reading the code, particularly around DOM timing problems. A specific example was the dark mode toggle button — it looked correctly written and didn't throw any obvious errors, but simply didn't work when clicked. I used AI here because this kind of bug is subtle: the code is syntactically valid, so there's no red underline or console error pointing you to the problem unless you actually check the console output, and it requires understanding the order in which the browser executes script versus when dynamically-injected HTML actually exists in the DOM. AI was useful for walking through </w:t>
             </w:r>
             <w:r>
-              <w:t>.</w:t>
+              <w:rPr>
+                <w:i/>
+                <w:iCs/>
+              </w:rPr>
+              <w:t>why</w:t>
             </w:r>
             <w:r>
-              <w:t xml:space="preserve"> I struggled with writing clean, responsive code for interactive features like toggling menus and validating forms</w:t>
-            </w:r>
-            <w:r>
-              <w:t xml:space="preserve">, </w:t>
-            </w:r>
-            <w:r>
-              <w:t>AI provided quick examples, explained concepts clearly, and gave me a starting point to build from. Instead of searching through multiple tutorials, I could get targeted snippets and adapt them to my project.</w:t>
-            </w:r>
-            <w:r>
-              <w:t xml:space="preserve"> </w:t>
-            </w:r>
-            <w:r>
-              <w:t>This saved time, helped me understand best practices, and improved the overall quality of my website’s interactivity.</w:t>
-            </w:r>
-          </w:p>
-          <w:p>
-            <w:pPr>
-              <w:pStyle w:val="ListParagraph"/>
-              <w:tabs>
-                <w:tab w:val="left" w:pos="426"/>
-              </w:tabs>
-              <w:ind w:left="0"/>
-            </w:pPr>
-          </w:p>
-          <w:p>
-            <w:pPr>
-              <w:tabs>
-                <w:tab w:val="left" w:pos="426"/>
-              </w:tabs>
-            </w:pPr>
-            <w:r>
-              <w:t>AI was used to</w:t>
-            </w:r>
-            <w:r>
-              <w:t xml:space="preserve"> generat</w:t>
-            </w:r>
-            <w:r>
-              <w:t>e</w:t>
-            </w:r>
-            <w:r>
-              <w:t xml:space="preserve"> </w:t>
-            </w:r>
-            <w:r>
-              <w:t xml:space="preserve">starter codes snippets </w:t>
-            </w:r>
-            <w:r>
-              <w:t>when I needed to implement interactive features like the hamburger menu. Instead of writing everything from scratch, I asked AI to provide a basic JavaScript function to toggle the menu. This saved time and gave me a clear foundation to build on. I chose to use AI because it provided quick, working examples that helped me focus on customizing the feature to my project’s needs rather than struggling with syntax or logic errors. It also acted like a coding assistant, explaining how the DOM was being manipulated, which deepened my understanding.</w:t>
-            </w:r>
-          </w:p>
-          <w:p>
-            <w:pPr>
-              <w:pStyle w:val="ListParagraph"/>
-              <w:tabs>
-                <w:tab w:val="left" w:pos="426"/>
-              </w:tabs>
-              <w:ind w:left="0"/>
-            </w:pPr>
-          </w:p>
-          <w:p>
-            <w:pPr>
-              <w:pStyle w:val="ListParagraph"/>
-              <w:tabs>
-                <w:tab w:val="left" w:pos="426"/>
-              </w:tabs>
-              <w:ind w:left="0"/>
-              <w:rPr>
-                <w:b/>
-                <w:bCs/>
-              </w:rPr>
-            </w:pPr>
-            <w:r>
-              <w:rPr>
-                <w:b/>
-                <w:bCs/>
-              </w:rPr>
-              <w:t>before</w:t>
-            </w:r>
-          </w:p>
-          <w:p>
-            <w:pPr>
-              <w:pStyle w:val="ListParagraph"/>
-              <w:tabs>
-                <w:tab w:val="left" w:pos="426"/>
-              </w:tabs>
-              <w:ind w:left="0"/>
-              <w:rPr>
-                <w:b/>
-                <w:bCs/>
-              </w:rPr>
-            </w:pPr>
-            <w:r>
-              <w:rPr>
-                <w:b/>
-                <w:bCs/>
-                <w:noProof/>
-              </w:rPr>
-              <w:drawing>
-                <wp:inline distT="0" distB="0" distL="0" distR="0" wp14:anchorId="05AAFC25" wp14:editId="3641F074">
-                  <wp:extent cx="5731510" cy="4111625"/>
-                  <wp:effectExtent l="0" t="0" r="2540" b="3175"/>
-                  <wp:docPr id="1406413326" name="Picture 4"/>
-                  <wp:cNvGraphicFramePr>
-                    <a:graphicFrameLocks xmlns:a="http://schemas.openxmlformats.org/drawingml/2006/main" noChangeAspect="1"/>
-                  </wp:cNvGraphicFramePr>
-                  <a:graphic xmlns:a="http://schemas.openxmlformats.org/drawingml/2006/main">
-                    <a:graphicData uri="http://schemas.openxmlformats.org/drawingml/2006/picture">
-                      <pic:pic xmlns:pic="http://schemas.openxmlformats.org/drawingml/2006/picture">
-                        <pic:nvPicPr>
-                          <pic:cNvPr id="1406413326" name="Picture 1406413326"/>
-                          <pic:cNvPicPr/>
-                        </pic:nvPicPr>
-                        <pic:blipFill>
-                          <a:blip r:embed="rId10" cstate="print">
-                            <a:extLst>
-                              <a:ext uri="{28A0092B-C50C-407E-A947-70E740481C1C}">
-                                <a14:useLocalDpi xmlns:a14="http://schemas.microsoft.com/office/drawing/2010/main" val="0"/>
-                              </a:ext>
-                            </a:extLst>
-                          </a:blip>
-                          <a:stretch>
-                            <a:fillRect/>
-                          </a:stretch>
-                        </pic:blipFill>
-                        <pic:spPr>
-                          <a:xfrm>
-                            <a:off x="0" y="0"/>
-                            <a:ext cx="5731510" cy="4111625"/>
-                          </a:xfrm>
-                          <a:prstGeom prst="rect">
-                            <a:avLst/>
-                          </a:prstGeom>
-                        </pic:spPr>
-                      </pic:pic>
-                    </a:graphicData>
-                  </a:graphic>
-                </wp:inline>
-              </w:drawing>
+              <w:t xml:space="preserve"> the bug was happening rather than just handing me a fix, which helped me actually understand event binding and DOM timing rather than just copy-pasting a solution. I also used AI for smaller tasks like brainstorming where to visually place a new feature (the theme toggle) in a way that stayed consistent with the existing navbar design, and for CSS structuring advice on using custom properties for theming.</w:t>
             </w:r>
           </w:p>
           <w:p>
@@ -2523,7 +1400,14 @@
                 <w:b/>
                 <w:bCs/>
               </w:rPr>
-              <w:t>Modified</w:t>
+              <w:t>B</w:t>
+            </w:r>
+            <w:r>
+              <w:rPr>
+                <w:b/>
+                <w:bCs/>
+              </w:rPr>
+              <w:t>efore</w:t>
             </w:r>
           </w:p>
           <w:p>
@@ -2542,14 +1426,12 @@
               <w:rPr>
                 <w:b/>
                 <w:bCs/>
-                <w:noProof/>
               </w:rPr>
-              <w:lastRenderedPageBreak/>
               <w:drawing>
-                <wp:inline distT="0" distB="0" distL="0" distR="0" wp14:anchorId="39B6BDA9" wp14:editId="3D2E5A10">
-                  <wp:extent cx="5731510" cy="2708910"/>
+                <wp:inline distT="0" distB="0" distL="0" distR="0" wp14:anchorId="6BC33270" wp14:editId="3A72E5DA">
+                  <wp:extent cx="5731510" cy="876300"/>
                   <wp:effectExtent l="0" t="0" r="2540" b="0"/>
-                  <wp:docPr id="1310240371" name="Picture 5"/>
+                  <wp:docPr id="167341716" name="Picture 1"/>
                   <wp:cNvGraphicFramePr>
                     <a:graphicFrameLocks xmlns:a="http://schemas.openxmlformats.org/drawingml/2006/main" noChangeAspect="1"/>
                   </wp:cNvGraphicFramePr>
@@ -2557,17 +1439,11 @@
                     <a:graphicData uri="http://schemas.openxmlformats.org/drawingml/2006/picture">
                       <pic:pic xmlns:pic="http://schemas.openxmlformats.org/drawingml/2006/picture">
                         <pic:nvPicPr>
-                          <pic:cNvPr id="1310240371" name="Picture 1310240371"/>
+                          <pic:cNvPr id="167341716" name=""/>
                           <pic:cNvPicPr/>
                         </pic:nvPicPr>
                         <pic:blipFill>
-                          <a:blip r:embed="rId11" cstate="print">
-                            <a:extLst>
-                              <a:ext uri="{28A0092B-C50C-407E-A947-70E740481C1C}">
-                                <a14:useLocalDpi xmlns:a14="http://schemas.microsoft.com/office/drawing/2010/main" val="0"/>
-                              </a:ext>
-                            </a:extLst>
-                          </a:blip>
+                          <a:blip r:embed="rId10"/>
                           <a:stretch>
                             <a:fillRect/>
                           </a:stretch>
@@ -2575,7 +1451,7 @@
                         <pic:spPr>
                           <a:xfrm>
                             <a:off x="0" y="0"/>
-                            <a:ext cx="5731510" cy="2708910"/>
+                            <a:ext cx="5731510" cy="876300"/>
                           </a:xfrm>
                           <a:prstGeom prst="rect">
                             <a:avLst/>
@@ -2613,6 +1489,13 @@
                 <w:bCs/>
               </w:rPr>
             </w:pPr>
+            <w:r>
+              <w:rPr>
+                <w:b/>
+                <w:bCs/>
+              </w:rPr>
+              <w:t>After</w:t>
+            </w:r>
           </w:p>
           <w:p>
             <w:pPr>
@@ -2626,32 +1509,47 @@
                 <w:bCs/>
               </w:rPr>
             </w:pPr>
-          </w:p>
-          <w:p>
-            <w:pPr>
-              <w:pStyle w:val="ListParagraph"/>
-              <w:tabs>
-                <w:tab w:val="left" w:pos="426"/>
-              </w:tabs>
-              <w:ind w:left="0"/>
+            <w:r>
               <w:rPr>
                 <w:b/>
                 <w:bCs/>
               </w:rPr>
-            </w:pPr>
-          </w:p>
-          <w:p>
-            <w:pPr>
-              <w:pStyle w:val="ListParagraph"/>
-              <w:tabs>
-                <w:tab w:val="left" w:pos="426"/>
-              </w:tabs>
-              <w:ind w:left="0"/>
-              <w:rPr>
-                <w:b/>
-                <w:bCs/>
-              </w:rPr>
-            </w:pPr>
+              <w:drawing>
+                <wp:inline distT="0" distB="0" distL="0" distR="0" wp14:anchorId="72173BAA" wp14:editId="0058EC09">
+                  <wp:extent cx="5731510" cy="2230120"/>
+                  <wp:effectExtent l="0" t="0" r="2540" b="0"/>
+                  <wp:docPr id="524643058" name="Picture 1"/>
+                  <wp:cNvGraphicFramePr>
+                    <a:graphicFrameLocks xmlns:a="http://schemas.openxmlformats.org/drawingml/2006/main" noChangeAspect="1"/>
+                  </wp:cNvGraphicFramePr>
+                  <a:graphic xmlns:a="http://schemas.openxmlformats.org/drawingml/2006/main">
+                    <a:graphicData uri="http://schemas.openxmlformats.org/drawingml/2006/picture">
+                      <pic:pic xmlns:pic="http://schemas.openxmlformats.org/drawingml/2006/picture">
+                        <pic:nvPicPr>
+                          <pic:cNvPr id="524643058" name=""/>
+                          <pic:cNvPicPr/>
+                        </pic:nvPicPr>
+                        <pic:blipFill>
+                          <a:blip r:embed="rId11"/>
+                          <a:stretch>
+                            <a:fillRect/>
+                          </a:stretch>
+                        </pic:blipFill>
+                        <pic:spPr>
+                          <a:xfrm>
+                            <a:off x="0" y="0"/>
+                            <a:ext cx="5731510" cy="2230120"/>
+                          </a:xfrm>
+                          <a:prstGeom prst="rect">
+                            <a:avLst/>
+                          </a:prstGeom>
+                        </pic:spPr>
+                      </pic:pic>
+                    </a:graphicData>
+                  </a:graphic>
+                </wp:inline>
+              </w:drawing>
+            </w:r>
           </w:p>
         </w:tc>
       </w:tr>
@@ -2813,7 +1711,6 @@
         <w:docPartUnique/>
       </w:docPartObj>
     </w:sdtPr>
-    <w:sdtEndPr/>
     <w:sdtContent>
       <w:sdt>
         <w:sdtPr>
@@ -2823,7 +1720,6 @@
             <w:docPartUnique/>
           </w:docPartObj>
         </w:sdtPr>
-        <w:sdtEndPr/>
         <w:sdtContent>
           <w:p>
             <w:pPr>
@@ -8574,6 +7470,28 @@
 </file>
 
 <file path=customXml/item1.xml><?xml version="1.0" encoding="utf-8"?>
+<p:properties xmlns:p="http://schemas.microsoft.com/office/2006/metadata/properties" xmlns:xsi="http://www.w3.org/2001/XMLSchema-instance" xmlns:pc="http://schemas.microsoft.com/office/infopath/2007/PartnerControls">
+  <documentManagement>
+    <_ip_UnifiedCompliancePolicyUIAction xmlns="http://schemas.microsoft.com/sharepoint/v3" xsi:nil="true"/>
+    <lcf76f155ced4ddcb4097134ff3c332f xmlns="b7fad248-bdcd-4271-9916-809a465982f7">
+      <Terms xmlns="http://schemas.microsoft.com/office/infopath/2007/PartnerControls"/>
+    </lcf76f155ced4ddcb4097134ff3c332f>
+    <_ip_UnifiedCompliancePolicyProperties xmlns="http://schemas.microsoft.com/sharepoint/v3" xsi:nil="true"/>
+    <TaxCatchAll xmlns="02435ef8-874b-49fb-b034-023fbc1b0e17" xsi:nil="true"/>
+  </documentManagement>
+</p:properties>
+</file>
+
+<file path=customXml/item2.xml><?xml version="1.0" encoding="utf-8"?>
+<?mso-contentType ?>
+<FormTemplates xmlns="http://schemas.microsoft.com/sharepoint/v3/contenttype/forms">
+  <Display>DocumentLibraryForm</Display>
+  <Edit>DocumentLibraryForm</Edit>
+  <New>DocumentLibraryForm</New>
+</FormTemplates>
+</file>
+
+<file path=customXml/item3.xml><?xml version="1.0" encoding="utf-8"?>
 <ct:contentTypeSchema xmlns:ct="http://schemas.microsoft.com/office/2006/metadata/contentType" xmlns:ma="http://schemas.microsoft.com/office/2006/metadata/properties/metaAttributes" ct:_="" ma:_="" ma:contentTypeName="Document" ma:contentTypeID="0x01010095B83DA6990E41418BCDB3837731DDD9" ma:contentTypeVersion="12" ma:contentTypeDescription="Create a new document." ma:contentTypeScope="" ma:versionID="9a0e40b26489cf95b92c0935470f1e05">
   <xsd:schema xmlns:xsd="http://www.w3.org/2001/XMLSchema" xmlns:xs="http://www.w3.org/2001/XMLSchema" xmlns:p="http://schemas.microsoft.com/office/2006/metadata/properties" xmlns:ns1="http://schemas.microsoft.com/sharepoint/v3" xmlns:ns2="b7fad248-bdcd-4271-9916-809a465982f7" xmlns:ns3="02435ef8-874b-49fb-b034-023fbc1b0e17" targetNamespace="http://schemas.microsoft.com/office/2006/metadata/properties" ma:root="true" ma:fieldsID="f5cd93c5e221519b9b0b4981d98a568c" ns1:_="" ns2:_="" ns3:_="">
     <xsd:import namespace="http://schemas.microsoft.com/sharepoint/v3"/>
@@ -8779,29 +7697,27 @@
 </ct:contentTypeSchema>
 </file>
 
-<file path=customXml/item2.xml><?xml version="1.0" encoding="utf-8"?>
-<?mso-contentType ?>
-<FormTemplates xmlns="http://schemas.microsoft.com/sharepoint/v3/contenttype/forms">
-  <Display>DocumentLibraryForm</Display>
-  <Edit>DocumentLibraryForm</Edit>
-  <New>DocumentLibraryForm</New>
-</FormTemplates>
+<file path=customXml/itemProps1.xml><?xml version="1.0" encoding="utf-8"?>
+<ds:datastoreItem xmlns:ds="http://schemas.openxmlformats.org/officeDocument/2006/customXml" ds:itemID="{451C2406-06F5-4301-9967-C40BCABE7AD8}">
+  <ds:schemaRefs>
+    <ds:schemaRef ds:uri="http://schemas.microsoft.com/office/2006/metadata/properties"/>
+    <ds:schemaRef ds:uri="http://schemas.microsoft.com/office/infopath/2007/PartnerControls"/>
+    <ds:schemaRef ds:uri="http://schemas.microsoft.com/sharepoint/v3"/>
+    <ds:schemaRef ds:uri="b7fad248-bdcd-4271-9916-809a465982f7"/>
+    <ds:schemaRef ds:uri="02435ef8-874b-49fb-b034-023fbc1b0e17"/>
+  </ds:schemaRefs>
+</ds:datastoreItem>
 </file>
 
-<file path=customXml/item3.xml><?xml version="1.0" encoding="utf-8"?>
-<p:properties xmlns:p="http://schemas.microsoft.com/office/2006/metadata/properties" xmlns:xsi="http://www.w3.org/2001/XMLSchema-instance" xmlns:pc="http://schemas.microsoft.com/office/infopath/2007/PartnerControls">
-  <documentManagement>
-    <_ip_UnifiedCompliancePolicyUIAction xmlns="http://schemas.microsoft.com/sharepoint/v3" xsi:nil="true"/>
-    <lcf76f155ced4ddcb4097134ff3c332f xmlns="b7fad248-bdcd-4271-9916-809a465982f7">
-      <Terms xmlns="http://schemas.microsoft.com/office/infopath/2007/PartnerControls"/>
-    </lcf76f155ced4ddcb4097134ff3c332f>
-    <_ip_UnifiedCompliancePolicyProperties xmlns="http://schemas.microsoft.com/sharepoint/v3" xsi:nil="true"/>
-    <TaxCatchAll xmlns="02435ef8-874b-49fb-b034-023fbc1b0e17" xsi:nil="true"/>
-  </documentManagement>
-</p:properties>
+<file path=customXml/itemProps2.xml><?xml version="1.0" encoding="utf-8"?>
+<ds:datastoreItem xmlns:ds="http://schemas.openxmlformats.org/officeDocument/2006/customXml" ds:itemID="{891417BF-93F5-4F68-A276-BE80032FE8B6}">
+  <ds:schemaRefs>
+    <ds:schemaRef ds:uri="http://schemas.microsoft.com/sharepoint/v3/contenttype/forms"/>
+  </ds:schemaRefs>
+</ds:datastoreItem>
 </file>
 
-<file path=customXml/itemProps1.xml><?xml version="1.0" encoding="utf-8"?>
+<file path=customXml/itemProps3.xml><?xml version="1.0" encoding="utf-8"?>
 <ds:datastoreItem xmlns:ds="http://schemas.openxmlformats.org/officeDocument/2006/customXml" ds:itemID="{C936C116-FB31-4FEA-9B17-D53394B2065A}">
   <ds:schemaRefs>
     <ds:schemaRef ds:uri="http://schemas.microsoft.com/office/2006/metadata/contentType"/>
@@ -8819,24 +7735,4 @@
     <ds:schemaRef ds:uri="http://schemas.microsoft.com/internal/obd"/>
   </ds:schemaRefs>
 </ds:datastoreItem>
-</file>
-
-<file path=customXml/itemProps2.xml><?xml version="1.0" encoding="utf-8"?>
-<ds:datastoreItem xmlns:ds="http://schemas.openxmlformats.org/officeDocument/2006/customXml" ds:itemID="{891417BF-93F5-4F68-A276-BE80032FE8B6}">
-  <ds:schemaRefs>
-    <ds:schemaRef ds:uri="http://schemas.microsoft.com/sharepoint/v3/contenttype/forms"/>
-  </ds:schemaRefs>
-</ds:datastoreItem>
-</file>
-
-<file path=customXml/itemProps3.xml><?xml version="1.0" encoding="utf-8"?>
-<ds:datastoreItem xmlns:ds="http://schemas.openxmlformats.org/officeDocument/2006/customXml" ds:itemID="{451C2406-06F5-4301-9967-C40BCABE7AD8}">
-  <ds:schemaRefs>
-    <ds:schemaRef ds:uri="http://schemas.microsoft.com/office/2006/metadata/properties"/>
-    <ds:schemaRef ds:uri="http://schemas.microsoft.com/office/infopath/2007/PartnerControls"/>
-    <ds:schemaRef ds:uri="http://schemas.microsoft.com/sharepoint/v3"/>
-    <ds:schemaRef ds:uri="b7fad248-bdcd-4271-9916-809a465982f7"/>
-    <ds:schemaRef ds:uri="02435ef8-874b-49fb-b034-023fbc1b0e17"/>
-  </ds:schemaRefs>
-</ds:datastoreItem>
 </file>
</xml_diff>